<commit_message>
how to import-module or reference-module-in-another-module
</commit_message>
<xml_diff>
--- a/Doc/OnTap/2_ThucHanh_Verilog.docx
+++ b/Doc/OnTap/2_ThucHanh_Verilog.docx
@@ -1,30 +1,30 @@
 
 <file path=word/document.xml><?xml version="1.0" encoding="utf-8"?>
-<w:document xmlns:o="urn:schemas-microsoft-com:office:office" xmlns:r="http://schemas.openxmlformats.org/officeDocument/2006/relationships" xmlns:v="urn:schemas-microsoft-com:vml" xmlns:w="http://schemas.openxmlformats.org/wordprocessingml/2006/main" xmlns:w10="urn:schemas-microsoft-com:office:word" xmlns:wp="http://schemas.openxmlformats.org/drawingml/2006/wordprocessingDrawing" xmlns:pic="http://schemas.openxmlformats.org/drawingml/2006/picture" xmlns:wps="http://schemas.microsoft.com/office/word/2010/wordprocessingShape" xmlns:wpg="http://schemas.microsoft.com/office/word/2010/wordprocessingGroup" xmlns:mc="http://schemas.openxmlformats.org/markup-compatibility/2006" xmlns:wp14="http://schemas.microsoft.com/office/word/2010/wordprocessingDrawing" xmlns:w14="http://schemas.microsoft.com/office/word/2010/wordml" xmlns:w15="http://schemas.microsoft.com/office/word/2012/wordml" mc:Ignorable="w14 wp14 w15">
+<w:document xmlns:o="urn:schemas-microsoft-com:office:office" xmlns:r="http://schemas.openxmlformats.org/officeDocument/2006/relationships" xmlns:v="urn:schemas-microsoft-com:vml" xmlns:w="http://schemas.openxmlformats.org/wordprocessingml/2006/main" xmlns:w10="urn:schemas-microsoft-com:office:word" xmlns:wp="http://schemas.openxmlformats.org/drawingml/2006/wordprocessingDrawing" xmlns:wps="http://schemas.microsoft.com/office/word/2010/wordprocessingShape" xmlns:wpg="http://schemas.microsoft.com/office/word/2010/wordprocessingGroup" xmlns:mc="http://schemas.openxmlformats.org/markup-compatibility/2006" xmlns:wp14="http://schemas.microsoft.com/office/word/2010/wordprocessingDrawing" xmlns:w14="http://schemas.microsoft.com/office/word/2010/wordml" xmlns:w15="http://schemas.microsoft.com/office/word/2012/wordml" mc:Ignorable="w14 wp14 w15">
   <w:body>
     <w:p>
       <w:pPr>
         <w:pStyle w:val="Heading1"/>
+        <w:numPr>
+          <w:ilvl w:val="0"/>
+          <w:numId w:val="2"/>
+        </w:numPr>
         <w:bidi w:val="0"/>
         <w:spacing w:before="240" w:after="120"/>
-        <w:ind w:hanging="0" w:start="0"/>
-        <w:jc w:val="start"/>
-        <w:rPr/>
-      </w:pPr>
-      <w:r>
-        <w:rPr/>
-        <w:t xml:space="preserve">1) </w:t>
-      </w:r>
-      <w:r>
-        <w:rPr/>
-        <w:t>Cài đặt</w:t>
+        <w:ind w:hanging="0" w:left="0"/>
+        <w:jc w:val="left"/>
+        <w:rPr/>
+      </w:pPr>
+      <w:r>
+        <w:rPr/>
+        <w:t>1) Cài đặt</w:t>
       </w:r>
     </w:p>
     <w:p>
       <w:pPr>
         <w:pStyle w:val="Normal"/>
         <w:bidi w:val="0"/>
-        <w:jc w:val="start"/>
+        <w:jc w:val="left"/>
         <w:rPr/>
       </w:pPr>
       <w:r>
@@ -35,18 +35,15 @@
       <w:pPr>
         <w:pStyle w:val="Normal"/>
         <w:bidi w:val="0"/>
-        <w:jc w:val="start"/>
-        <w:rPr/>
-      </w:pPr>
-      <w:r>
-        <w:rPr/>
-        <w:t xml:space="preserve">                                                                                                                                                                                                            </w:t>
-      </w:r>
-      <w:r>
+        <w:jc w:val="left"/>
+        <w:rPr/>
+      </w:pPr>
+      <w:r>
+        <w:rPr/>
         <mc:AlternateContent>
           <mc:Choice Requires="wps">
             <w:drawing>
-              <wp:anchor distT="0" distB="0" distL="0" distR="0" simplePos="0" relativeHeight="2" behindDoc="0" locked="0" layoutInCell="0" allowOverlap="1">
+              <wp:anchor behindDoc="0" distT="0" distB="0" distL="0" distR="0" simplePos="0" locked="0" layoutInCell="0" allowOverlap="1" relativeHeight="2">
                 <wp:simplePos x="0" y="0"/>
                 <wp:positionH relativeFrom="column">
                   <wp:align>center</wp:align>
@@ -61,17 +58,28 @@
                 <a:graphic xmlns:a="http://schemas.openxmlformats.org/drawingml/2006/main">
                   <a:graphicData uri="http://schemas.microsoft.com/office/word/2010/wordprocessingShape">
                     <wps:wsp>
-                      <wps:cNvSpPr txBox="1"/>
+                      <wps:cNvSpPr/>
                       <wps:spPr>
                         <a:xfrm>
                           <a:off x="0" y="0"/>
-                          <a:ext cx="5820410" cy="6443345"/>
+                          <a:ext cx="5820480" cy="6443280"/>
                         </a:xfrm>
-                        <a:prstGeom prst="rect"/>
+                        <a:prstGeom prst="rect">
+                          <a:avLst/>
+                        </a:prstGeom>
                         <a:solidFill>
-                          <a:srgbClr val="FFFFFF"/>
+                          <a:srgbClr val="ffffff"/>
                         </a:solidFill>
+                        <a:ln w="0">
+                          <a:noFill/>
+                        </a:ln>
                       </wps:spPr>
+                      <wps:style>
+                        <a:lnRef idx="0"/>
+                        <a:fillRef idx="0"/>
+                        <a:effectRef idx="0"/>
+                        <a:fontRef idx="minor"/>
+                      </wps:style>
                       <wps:txbx>
                         <w:txbxContent>
                           <w:p>
@@ -79,7 +87,7 @@
                               <w:pStyle w:val="Figure"/>
                               <w:bidi w:val="0"/>
                               <w:spacing w:before="120" w:after="120"/>
-                              <w:jc w:val="start"/>
+                              <w:jc w:val="left"/>
                               <w:rPr/>
                             </w:pPr>
                             <w:r>
@@ -88,7 +96,7 @@
                                 <wp:inline distT="0" distB="0" distL="0" distR="0">
                                   <wp:extent cx="5820410" cy="6191885"/>
                                   <wp:effectExtent l="0" t="0" r="0" b="0"/>
-                                  <wp:docPr id="2" name="Image1"/>
+                                  <wp:docPr id="3" name="Image1" descr=""/>
                                   <wp:cNvGraphicFramePr>
                                     <a:graphicFrameLocks xmlns:a="http://schemas.openxmlformats.org/drawingml/2006/main" noChangeAspect="1"/>
                                   </wp:cNvGraphicFramePr>
@@ -96,7 +104,7 @@
                                     <a:graphicData uri="http://schemas.openxmlformats.org/drawingml/2006/picture">
                                       <pic:pic xmlns:pic="http://schemas.openxmlformats.org/drawingml/2006/picture">
                                         <pic:nvPicPr>
-                                          <pic:cNvPr id="2" name="Image1"/>
+                                          <pic:cNvPr id="3" name="Image1" descr=""/>
                                           <pic:cNvPicPr>
                                             <a:picLocks noChangeAspect="1" noChangeArrowheads="1"/>
                                           </pic:cNvPicPr>
@@ -115,13 +123,15 @@
                                           <a:prstGeom prst="rect">
                                             <a:avLst/>
                                           </a:prstGeom>
-                                          <a:noFill/>
                                         </pic:spPr>
                                       </pic:pic>
                                     </a:graphicData>
                                   </a:graphic>
                                 </wp:inline>
                               </w:drawing>
+                            </w:r>
+                            <w:r>
+                              <w:rPr/>
                               <w:t xml:space="preserve">Figure </w:t>
                             </w:r>
                             <w:r>
@@ -151,7 +161,7 @@
                           </w:p>
                         </w:txbxContent>
                       </wps:txbx>
-                      <wps:bodyPr anchor="t" lIns="0" tIns="0" rIns="0" bIns="0">
+                      <wps:bodyPr lIns="0" rIns="0" tIns="0" bIns="0" anchor="t">
                         <a:noAutofit/>
                       </wps:bodyPr>
                     </wps:wsp>
@@ -162,15 +172,17 @@
           </mc:Choice>
           <mc:Fallback>
             <w:pict>
-              <v:rect style="position:absolute;rotation:-0;width:458.3pt;height:507.35pt;mso-wrap-distance-left:0pt;mso-wrap-distance-right:0pt;mso-wrap-distance-top:0pt;mso-wrap-distance-bottom:0pt;margin-top:0pt;mso-position-vertical:top;mso-position-vertical-relative:text;margin-left:20.15pt;mso-position-horizontal:center;mso-position-horizontal-relative:text">
-                <v:textbox inset="0in,0in,0in,0in">
+              <v:rect id="shape_0" ID="Frame1" path="m0,0l-2147483645,0l-2147483645,-2147483646l0,-2147483646xe" fillcolor="white" stroked="f" o:allowincell="f" style="position:absolute;margin-left:20.15pt;margin-top:0.05pt;width:458.25pt;height:507.3pt;mso-wrap-style:square;v-text-anchor:top;mso-position-horizontal:center">
+                <v:fill o:detectmouseclick="t" type="solid" color2="black"/>
+                <v:stroke color="#3465a4" joinstyle="round" endcap="flat"/>
+                <v:textbox>
                   <w:txbxContent>
                     <w:p>
                       <w:pPr>
                         <w:pStyle w:val="Figure"/>
                         <w:bidi w:val="0"/>
                         <w:spacing w:before="120" w:after="120"/>
-                        <w:jc w:val="start"/>
+                        <w:jc w:val="left"/>
                         <w:rPr/>
                       </w:pPr>
                       <w:r>
@@ -179,7 +191,7 @@
                           <wp:inline distT="0" distB="0" distL="0" distR="0">
                             <wp:extent cx="5820410" cy="6191885"/>
                             <wp:effectExtent l="0" t="0" r="0" b="0"/>
-                            <wp:docPr id="3" name="Image1"/>
+                            <wp:docPr id="4" name="Image1" descr=""/>
                             <wp:cNvGraphicFramePr>
                               <a:graphicFrameLocks xmlns:a="http://schemas.openxmlformats.org/drawingml/2006/main" noChangeAspect="1"/>
                             </wp:cNvGraphicFramePr>
@@ -187,7 +199,7 @@
                               <a:graphicData uri="http://schemas.openxmlformats.org/drawingml/2006/picture">
                                 <pic:pic xmlns:pic="http://schemas.openxmlformats.org/drawingml/2006/picture">
                                   <pic:nvPicPr>
-                                    <pic:cNvPr id="3" name="Image1"/>
+                                    <pic:cNvPr id="4" name="Image1" descr=""/>
                                     <pic:cNvPicPr>
                                       <a:picLocks noChangeAspect="1" noChangeArrowheads="1"/>
                                     </pic:cNvPicPr>
@@ -206,13 +218,15 @@
                                     <a:prstGeom prst="rect">
                                       <a:avLst/>
                                     </a:prstGeom>
-                                    <a:noFill/>
                                   </pic:spPr>
                                 </pic:pic>
                               </a:graphicData>
                             </a:graphic>
                           </wp:inline>
                         </w:drawing>
+                      </w:r>
+                      <w:r>
+                        <w:rPr/>
                         <w:t xml:space="preserve">Figure </w:t>
                       </w:r>
                       <w:r>
@@ -248,12 +262,16 @@
           </mc:Fallback>
         </mc:AlternateContent>
       </w:r>
+      <w:r>
+        <w:rPr/>
+        <w:t xml:space="preserve">                                                                                                                                                                                                            </w:t>
+      </w:r>
     </w:p>
     <w:p>
       <w:pPr>
         <w:pStyle w:val="Normal"/>
         <w:bidi w:val="0"/>
-        <w:jc w:val="start"/>
+        <w:jc w:val="left"/>
         <w:rPr/>
       </w:pPr>
       <w:r>
@@ -264,7 +282,7 @@
       <w:pPr>
         <w:pStyle w:val="Normal"/>
         <w:bidi w:val="0"/>
-        <w:jc w:val="start"/>
+        <w:jc w:val="left"/>
         <w:rPr/>
       </w:pPr>
       <w:r>
@@ -291,7 +309,8 @@
       <w:pPr>
         <w:pStyle w:val="Normal"/>
         <w:bidi w:val="0"/>
-        <w:jc w:val="start"/>
+        <w:spacing w:before="0" w:after="0"/>
+        <w:jc w:val="left"/>
         <w:rPr/>
       </w:pPr>
       <w:r>
@@ -301,9 +320,13 @@
     <w:p>
       <w:pPr>
         <w:pStyle w:val="Heading1"/>
-        <w:bidi w:val="0"/>
-        <w:ind w:hanging="0" w:start="0"/>
-        <w:jc w:val="start"/>
+        <w:numPr>
+          <w:ilvl w:val="0"/>
+          <w:numId w:val="2"/>
+        </w:numPr>
+        <w:bidi w:val="0"/>
+        <w:ind w:hanging="0" w:left="0"/>
+        <w:jc w:val="left"/>
         <w:rPr/>
       </w:pPr>
       <w:r>
@@ -378,13 +401,10 @@
       </w:pPr>
       <w:r>
         <w:rPr/>
-        <w:t xml:space="preserve">                                                                                                                                                                                                       </w:t>
-      </w:r>
-      <w:r>
         <mc:AlternateContent>
           <mc:Choice Requires="wps">
             <w:drawing>
-              <wp:anchor distT="0" distB="0" distL="0" distR="0" simplePos="0" relativeHeight="4" behindDoc="0" locked="0" layoutInCell="0" allowOverlap="1">
+              <wp:anchor behindDoc="0" distT="0" distB="0" distL="0" distR="0" simplePos="0" locked="0" layoutInCell="0" allowOverlap="1" relativeHeight="4">
                 <wp:simplePos x="0" y="0"/>
                 <wp:positionH relativeFrom="column">
                   <wp:align>center</wp:align>
@@ -395,21 +415,32 @@
                 <wp:extent cx="4877435" cy="2708910"/>
                 <wp:effectExtent l="0" t="0" r="0" b="0"/>
                 <wp:wrapSquare wrapText="largest"/>
-                <wp:docPr id="4" name="Frame2"/>
+                <wp:docPr id="2" name="Frame2"/>
                 <a:graphic xmlns:a="http://schemas.openxmlformats.org/drawingml/2006/main">
                   <a:graphicData uri="http://schemas.microsoft.com/office/word/2010/wordprocessingShape">
                     <wps:wsp>
-                      <wps:cNvSpPr txBox="1"/>
+                      <wps:cNvSpPr/>
                       <wps:spPr>
                         <a:xfrm>
                           <a:off x="0" y="0"/>
-                          <a:ext cx="4877435" cy="2708910"/>
+                          <a:ext cx="4877280" cy="2709000"/>
                         </a:xfrm>
-                        <a:prstGeom prst="rect"/>
+                        <a:prstGeom prst="rect">
+                          <a:avLst/>
+                        </a:prstGeom>
                         <a:solidFill>
-                          <a:srgbClr val="FFFFFF"/>
+                          <a:srgbClr val="ffffff"/>
                         </a:solidFill>
+                        <a:ln w="0">
+                          <a:noFill/>
+                        </a:ln>
                       </wps:spPr>
+                      <wps:style>
+                        <a:lnRef idx="0"/>
+                        <a:fillRef idx="0"/>
+                        <a:effectRef idx="0"/>
+                        <a:fontRef idx="minor"/>
+                      </wps:style>
                       <wps:txbx>
                         <w:txbxContent>
                           <w:p>
@@ -417,7 +448,7 @@
                               <w:pStyle w:val="Figure"/>
                               <w:bidi w:val="0"/>
                               <w:spacing w:before="120" w:after="120"/>
-                              <w:jc w:val="start"/>
+                              <w:jc w:val="left"/>
                               <w:rPr/>
                             </w:pPr>
                             <w:r>
@@ -426,7 +457,7 @@
                                 <wp:inline distT="0" distB="0" distL="0" distR="0">
                                   <wp:extent cx="4877435" cy="2457450"/>
                                   <wp:effectExtent l="0" t="0" r="0" b="0"/>
-                                  <wp:docPr id="5" name="Image2"/>
+                                  <wp:docPr id="4" name="Image2" descr=""/>
                                   <wp:cNvGraphicFramePr>
                                     <a:graphicFrameLocks xmlns:a="http://schemas.openxmlformats.org/drawingml/2006/main" noChangeAspect="1"/>
                                   </wp:cNvGraphicFramePr>
@@ -434,7 +465,7 @@
                                     <a:graphicData uri="http://schemas.openxmlformats.org/drawingml/2006/picture">
                                       <pic:pic xmlns:pic="http://schemas.openxmlformats.org/drawingml/2006/picture">
                                         <pic:nvPicPr>
-                                          <pic:cNvPr id="5" name="Image2"/>
+                                          <pic:cNvPr id="4" name="Image2" descr=""/>
                                           <pic:cNvPicPr>
                                             <a:picLocks noChangeAspect="1" noChangeArrowheads="1"/>
                                           </pic:cNvPicPr>
@@ -453,13 +484,15 @@
                                           <a:prstGeom prst="rect">
                                             <a:avLst/>
                                           </a:prstGeom>
-                                          <a:noFill/>
                                         </pic:spPr>
                                       </pic:pic>
                                     </a:graphicData>
                                   </a:graphic>
                                 </wp:inline>
                               </w:drawing>
+                            </w:r>
+                            <w:r>
+                              <w:rPr/>
                               <w:t xml:space="preserve">Figure </w:t>
                             </w:r>
                             <w:r>
@@ -489,7 +522,7 @@
                           </w:p>
                         </w:txbxContent>
                       </wps:txbx>
-                      <wps:bodyPr anchor="t" lIns="0" tIns="0" rIns="0" bIns="0">
+                      <wps:bodyPr lIns="0" rIns="0" tIns="0" bIns="0" anchor="t">
                         <a:noAutofit/>
                       </wps:bodyPr>
                     </wps:wsp>
@@ -500,15 +533,17 @@
           </mc:Choice>
           <mc:Fallback>
             <w:pict>
-              <v:rect style="position:absolute;rotation:-0;width:384.05pt;height:213.3pt;mso-wrap-distance-left:0pt;mso-wrap-distance-right:0pt;mso-wrap-distance-top:0pt;mso-wrap-distance-bottom:0pt;margin-top:0pt;mso-position-vertical:top;mso-position-vertical-relative:text;margin-left:57.3pt;mso-position-horizontal:center;mso-position-horizontal-relative:text">
-                <v:textbox inset="0in,0in,0in,0in">
+              <v:rect id="shape_0" ID="Frame2" path="m0,0l-2147483645,0l-2147483645,-2147483646l0,-2147483646xe" fillcolor="white" stroked="f" o:allowincell="f" style="position:absolute;margin-left:57.25pt;margin-top:0.05pt;width:384pt;height:213.25pt;mso-wrap-style:square;v-text-anchor:top;mso-position-horizontal:center">
+                <v:fill o:detectmouseclick="t" type="solid" color2="black"/>
+                <v:stroke color="#3465a4" joinstyle="round" endcap="flat"/>
+                <v:textbox>
                   <w:txbxContent>
                     <w:p>
                       <w:pPr>
                         <w:pStyle w:val="Figure"/>
                         <w:bidi w:val="0"/>
                         <w:spacing w:before="120" w:after="120"/>
-                        <w:jc w:val="start"/>
+                        <w:jc w:val="left"/>
                         <w:rPr/>
                       </w:pPr>
                       <w:r>
@@ -517,7 +552,7 @@
                           <wp:inline distT="0" distB="0" distL="0" distR="0">
                             <wp:extent cx="4877435" cy="2457450"/>
                             <wp:effectExtent l="0" t="0" r="0" b="0"/>
-                            <wp:docPr id="6" name="Image2"/>
+                            <wp:docPr id="5" name="Image2" descr=""/>
                             <wp:cNvGraphicFramePr>
                               <a:graphicFrameLocks xmlns:a="http://schemas.openxmlformats.org/drawingml/2006/main" noChangeAspect="1"/>
                             </wp:cNvGraphicFramePr>
@@ -525,7 +560,7 @@
                               <a:graphicData uri="http://schemas.openxmlformats.org/drawingml/2006/picture">
                                 <pic:pic xmlns:pic="http://schemas.openxmlformats.org/drawingml/2006/picture">
                                   <pic:nvPicPr>
-                                    <pic:cNvPr id="6" name="Image2"/>
+                                    <pic:cNvPr id="5" name="Image2" descr=""/>
                                     <pic:cNvPicPr>
                                       <a:picLocks noChangeAspect="1" noChangeArrowheads="1"/>
                                     </pic:cNvPicPr>
@@ -544,13 +579,15 @@
                                     <a:prstGeom prst="rect">
                                       <a:avLst/>
                                     </a:prstGeom>
-                                    <a:noFill/>
                                   </pic:spPr>
                                 </pic:pic>
                               </a:graphicData>
                             </a:graphic>
                           </wp:inline>
                         </w:drawing>
+                      </w:r>
+                      <w:r>
+                        <w:rPr/>
                         <w:t xml:space="preserve">Figure </w:t>
                       </w:r>
                       <w:r>
@@ -586,111 +623,113 @@
           </mc:Fallback>
         </mc:AlternateContent>
       </w:r>
-    </w:p>
-    <w:p>
-      <w:pPr>
-        <w:pStyle w:val="BodyText"/>
-        <w:bidi w:val="0"/>
-        <w:rPr/>
-      </w:pPr>
-      <w:r>
-        <w:rPr/>
-      </w:r>
-    </w:p>
-    <w:p>
-      <w:pPr>
-        <w:pStyle w:val="BodyText"/>
-        <w:bidi w:val="0"/>
-        <w:rPr/>
-      </w:pPr>
-      <w:r>
-        <w:rPr/>
-      </w:r>
-    </w:p>
-    <w:p>
-      <w:pPr>
-        <w:pStyle w:val="BodyText"/>
-        <w:bidi w:val="0"/>
-        <w:rPr/>
-      </w:pPr>
-      <w:r>
-        <w:rPr/>
-      </w:r>
-    </w:p>
-    <w:p>
-      <w:pPr>
-        <w:pStyle w:val="BodyText"/>
-        <w:bidi w:val="0"/>
-        <w:rPr/>
-      </w:pPr>
-      <w:r>
-        <w:rPr/>
-      </w:r>
-    </w:p>
-    <w:p>
-      <w:pPr>
-        <w:pStyle w:val="BodyText"/>
-        <w:bidi w:val="0"/>
-        <w:rPr/>
-      </w:pPr>
-      <w:r>
-        <w:rPr/>
-      </w:r>
-    </w:p>
-    <w:p>
-      <w:pPr>
-        <w:pStyle w:val="BodyText"/>
-        <w:bidi w:val="0"/>
-        <w:rPr/>
-      </w:pPr>
-      <w:r>
-        <w:rPr/>
-      </w:r>
-    </w:p>
-    <w:p>
-      <w:pPr>
-        <w:pStyle w:val="BodyText"/>
-        <w:bidi w:val="0"/>
-        <w:rPr/>
-      </w:pPr>
-      <w:r>
-        <w:rPr/>
-      </w:r>
-    </w:p>
-    <w:p>
-      <w:pPr>
-        <w:pStyle w:val="BodyText"/>
-        <w:bidi w:val="0"/>
-        <w:rPr/>
-      </w:pPr>
-      <w:r>
-        <w:rPr/>
-      </w:r>
-    </w:p>
-    <w:p>
-      <w:pPr>
-        <w:pStyle w:val="BodyText"/>
-        <w:bidi w:val="0"/>
-        <w:rPr/>
-      </w:pPr>
-      <w:r>
-        <w:rPr/>
-      </w:r>
-    </w:p>
-    <w:p>
-      <w:pPr>
-        <w:pStyle w:val="BodyText"/>
-        <w:bidi w:val="0"/>
-        <w:rPr/>
-      </w:pPr>
-      <w:r>
-        <w:rPr/>
-      </w:r>
-      <w:r>
+      <w:r>
+        <w:rPr/>
+        <w:t xml:space="preserve">                                                                                                                                                                                                       </w:t>
+      </w:r>
+    </w:p>
+    <w:p>
+      <w:pPr>
+        <w:pStyle w:val="BodyText"/>
+        <w:bidi w:val="0"/>
+        <w:rPr/>
+      </w:pPr>
+      <w:r>
+        <w:rPr/>
+      </w:r>
+    </w:p>
+    <w:p>
+      <w:pPr>
+        <w:pStyle w:val="BodyText"/>
+        <w:bidi w:val="0"/>
+        <w:rPr/>
+      </w:pPr>
+      <w:r>
+        <w:rPr/>
+      </w:r>
+    </w:p>
+    <w:p>
+      <w:pPr>
+        <w:pStyle w:val="BodyText"/>
+        <w:bidi w:val="0"/>
+        <w:rPr/>
+      </w:pPr>
+      <w:r>
+        <w:rPr/>
+      </w:r>
+    </w:p>
+    <w:p>
+      <w:pPr>
+        <w:pStyle w:val="BodyText"/>
+        <w:bidi w:val="0"/>
+        <w:rPr/>
+      </w:pPr>
+      <w:r>
+        <w:rPr/>
+      </w:r>
+    </w:p>
+    <w:p>
+      <w:pPr>
+        <w:pStyle w:val="BodyText"/>
+        <w:bidi w:val="0"/>
+        <w:rPr/>
+      </w:pPr>
+      <w:r>
+        <w:rPr/>
+      </w:r>
+    </w:p>
+    <w:p>
+      <w:pPr>
+        <w:pStyle w:val="BodyText"/>
+        <w:bidi w:val="0"/>
+        <w:rPr/>
+      </w:pPr>
+      <w:r>
+        <w:rPr/>
+      </w:r>
+    </w:p>
+    <w:p>
+      <w:pPr>
+        <w:pStyle w:val="BodyText"/>
+        <w:bidi w:val="0"/>
+        <w:rPr/>
+      </w:pPr>
+      <w:r>
+        <w:rPr/>
+      </w:r>
+    </w:p>
+    <w:p>
+      <w:pPr>
+        <w:pStyle w:val="BodyText"/>
+        <w:bidi w:val="0"/>
+        <w:rPr/>
+      </w:pPr>
+      <w:r>
+        <w:rPr/>
+      </w:r>
+    </w:p>
+    <w:p>
+      <w:pPr>
+        <w:pStyle w:val="BodyText"/>
+        <w:bidi w:val="0"/>
+        <w:rPr/>
+      </w:pPr>
+      <w:r>
+        <w:rPr/>
+      </w:r>
+    </w:p>
+    <w:p>
+      <w:pPr>
+        <w:pStyle w:val="BodyText"/>
+        <w:bidi w:val="0"/>
+        <w:rPr/>
+      </w:pPr>
+      <w:r>
+        <w:rPr/>
         <mc:AlternateContent>
           <mc:Choice Requires="wps">
             <w:drawing>
-              <wp:anchor distT="0" distB="0" distL="0" distR="0" simplePos="0" relativeHeight="6" behindDoc="0" locked="0" layoutInCell="0" allowOverlap="1">
+              <wp:anchor behindDoc="0" distT="0" distB="0" distL="0" distR="0" simplePos="0" locked="0" layoutInCell="0" allowOverlap="1" relativeHeight="7">
                 <wp:simplePos x="0" y="0"/>
                 <wp:positionH relativeFrom="column">
                   <wp:align>center</wp:align>
@@ -701,21 +740,32 @@
                 <wp:extent cx="6172835" cy="6319520"/>
                 <wp:effectExtent l="0" t="0" r="0" b="0"/>
                 <wp:wrapSquare wrapText="largest"/>
-                <wp:docPr id="7" name="Frame3"/>
+                <wp:docPr id="3" name="Frame3"/>
                 <a:graphic xmlns:a="http://schemas.openxmlformats.org/drawingml/2006/main">
                   <a:graphicData uri="http://schemas.microsoft.com/office/word/2010/wordprocessingShape">
                     <wps:wsp>
-                      <wps:cNvSpPr txBox="1"/>
+                      <wps:cNvSpPr/>
                       <wps:spPr>
                         <a:xfrm>
                           <a:off x="0" y="0"/>
-                          <a:ext cx="6172835" cy="6319520"/>
+                          <a:ext cx="6172920" cy="6319440"/>
                         </a:xfrm>
-                        <a:prstGeom prst="rect"/>
+                        <a:prstGeom prst="rect">
+                          <a:avLst/>
+                        </a:prstGeom>
                         <a:solidFill>
-                          <a:srgbClr val="FFFFFF"/>
+                          <a:srgbClr val="ffffff"/>
                         </a:solidFill>
+                        <a:ln w="0">
+                          <a:noFill/>
+                        </a:ln>
                       </wps:spPr>
+                      <wps:style>
+                        <a:lnRef idx="0"/>
+                        <a:fillRef idx="0"/>
+                        <a:effectRef idx="0"/>
+                        <a:fontRef idx="minor"/>
+                      </wps:style>
                       <wps:txbx>
                         <w:txbxContent>
                           <w:p>
@@ -723,7 +773,7 @@
                               <w:pStyle w:val="Figure"/>
                               <w:bidi w:val="0"/>
                               <w:spacing w:before="120" w:after="120"/>
-                              <w:jc w:val="start"/>
+                              <w:jc w:val="left"/>
                               <w:rPr/>
                             </w:pPr>
                             <w:r>
@@ -732,7 +782,7 @@
                                 <wp:inline distT="0" distB="0" distL="0" distR="0">
                                   <wp:extent cx="6172835" cy="6068060"/>
                                   <wp:effectExtent l="0" t="0" r="0" b="0"/>
-                                  <wp:docPr id="8" name="Image3"/>
+                                  <wp:docPr id="5" name="Image3" descr=""/>
                                   <wp:cNvGraphicFramePr>
                                     <a:graphicFrameLocks xmlns:a="http://schemas.openxmlformats.org/drawingml/2006/main" noChangeAspect="1"/>
                                   </wp:cNvGraphicFramePr>
@@ -740,7 +790,7 @@
                                     <a:graphicData uri="http://schemas.openxmlformats.org/drawingml/2006/picture">
                                       <pic:pic xmlns:pic="http://schemas.openxmlformats.org/drawingml/2006/picture">
                                         <pic:nvPicPr>
-                                          <pic:cNvPr id="8" name="Image3"/>
+                                          <pic:cNvPr id="5" name="Image3" descr=""/>
                                           <pic:cNvPicPr>
                                             <a:picLocks noChangeAspect="1" noChangeArrowheads="1"/>
                                           </pic:cNvPicPr>
@@ -759,13 +809,15 @@
                                           <a:prstGeom prst="rect">
                                             <a:avLst/>
                                           </a:prstGeom>
-                                          <a:noFill/>
                                         </pic:spPr>
                                       </pic:pic>
                                     </a:graphicData>
                                   </a:graphic>
                                 </wp:inline>
                               </w:drawing>
+                            </w:r>
+                            <w:r>
+                              <w:rPr/>
                               <w:t xml:space="preserve">Figure </w:t>
                             </w:r>
                             <w:r>
@@ -795,7 +847,7 @@
                           </w:p>
                         </w:txbxContent>
                       </wps:txbx>
-                      <wps:bodyPr anchor="t" lIns="0" tIns="0" rIns="0" bIns="0">
+                      <wps:bodyPr lIns="0" rIns="0" tIns="0" bIns="0" anchor="t">
                         <a:noAutofit/>
                       </wps:bodyPr>
                     </wps:wsp>
@@ -806,15 +858,17 @@
           </mc:Choice>
           <mc:Fallback>
             <w:pict>
-              <v:rect style="position:absolute;rotation:-0;width:486.05pt;height:497.6pt;mso-wrap-distance-left:0pt;mso-wrap-distance-right:0pt;mso-wrap-distance-top:0pt;mso-wrap-distance-bottom:0pt;margin-top:0pt;mso-position-vertical:top;mso-position-vertical-relative:text;margin-left:6.3pt;mso-position-horizontal:center;mso-position-horizontal-relative:text">
-                <v:textbox inset="0in,0in,0in,0in">
+              <v:rect id="shape_0" ID="Frame3" path="m0,0l-2147483645,0l-2147483645,-2147483646l0,-2147483646xe" fillcolor="white" stroked="f" o:allowincell="f" style="position:absolute;margin-left:6.25pt;margin-top:0.05pt;width:486pt;height:497.55pt;mso-wrap-style:square;v-text-anchor:top;mso-position-horizontal:center">
+                <v:fill o:detectmouseclick="t" type="solid" color2="black"/>
+                <v:stroke color="#3465a4" joinstyle="round" endcap="flat"/>
+                <v:textbox>
                   <w:txbxContent>
                     <w:p>
                       <w:pPr>
                         <w:pStyle w:val="Figure"/>
                         <w:bidi w:val="0"/>
                         <w:spacing w:before="120" w:after="120"/>
-                        <w:jc w:val="start"/>
+                        <w:jc w:val="left"/>
                         <w:rPr/>
                       </w:pPr>
                       <w:r>
@@ -823,7 +877,7 @@
                           <wp:inline distT="0" distB="0" distL="0" distR="0">
                             <wp:extent cx="6172835" cy="6068060"/>
                             <wp:effectExtent l="0" t="0" r="0" b="0"/>
-                            <wp:docPr id="9" name="Image3"/>
+                            <wp:docPr id="6" name="Image3" descr=""/>
                             <wp:cNvGraphicFramePr>
                               <a:graphicFrameLocks xmlns:a="http://schemas.openxmlformats.org/drawingml/2006/main" noChangeAspect="1"/>
                             </wp:cNvGraphicFramePr>
@@ -831,7 +885,7 @@
                               <a:graphicData uri="http://schemas.openxmlformats.org/drawingml/2006/picture">
                                 <pic:pic xmlns:pic="http://schemas.openxmlformats.org/drawingml/2006/picture">
                                   <pic:nvPicPr>
-                                    <pic:cNvPr id="9" name="Image3"/>
+                                    <pic:cNvPr id="6" name="Image3" descr=""/>
                                     <pic:cNvPicPr>
                                       <a:picLocks noChangeAspect="1" noChangeArrowheads="1"/>
                                     </pic:cNvPicPr>
@@ -850,13 +904,15 @@
                                     <a:prstGeom prst="rect">
                                       <a:avLst/>
                                     </a:prstGeom>
-                                    <a:noFill/>
                                   </pic:spPr>
                                 </pic:pic>
                               </a:graphicData>
                             </a:graphic>
                           </wp:inline>
                         </w:drawing>
+                      </w:r>
+                      <w:r>
+                        <w:rPr/>
                         <w:t xml:space="preserve">Figure </w:t>
                       </w:r>
                       <w:r>
@@ -912,12 +968,10 @@
       </w:pPr>
       <w:r>
         <w:rPr/>
-      </w:r>
-      <w:r>
         <mc:AlternateContent>
           <mc:Choice Requires="wps">
             <w:drawing>
-              <wp:anchor distT="0" distB="0" distL="0" distR="0" simplePos="0" relativeHeight="8" behindDoc="0" locked="0" layoutInCell="0" allowOverlap="1">
+              <wp:anchor behindDoc="0" distT="0" distB="0" distL="0" distR="0" simplePos="0" locked="0" layoutInCell="0" allowOverlap="1" relativeHeight="9">
                 <wp:simplePos x="0" y="0"/>
                 <wp:positionH relativeFrom="column">
                   <wp:align>center</wp:align>
@@ -928,21 +982,32 @@
                 <wp:extent cx="6332220" cy="403225"/>
                 <wp:effectExtent l="0" t="0" r="0" b="0"/>
                 <wp:wrapSquare wrapText="largest"/>
-                <wp:docPr id="10" name="Frame4"/>
+                <wp:docPr id="4" name="Frame4"/>
                 <a:graphic xmlns:a="http://schemas.openxmlformats.org/drawingml/2006/main">
                   <a:graphicData uri="http://schemas.microsoft.com/office/word/2010/wordprocessingShape">
                     <wps:wsp>
-                      <wps:cNvSpPr txBox="1"/>
+                      <wps:cNvSpPr/>
                       <wps:spPr>
                         <a:xfrm>
                           <a:off x="0" y="0"/>
-                          <a:ext cx="6332220" cy="403225"/>
+                          <a:ext cx="6332400" cy="403200"/>
                         </a:xfrm>
-                        <a:prstGeom prst="rect"/>
+                        <a:prstGeom prst="rect">
+                          <a:avLst/>
+                        </a:prstGeom>
                         <a:solidFill>
-                          <a:srgbClr val="FFFFFF"/>
+                          <a:srgbClr val="ffffff"/>
                         </a:solidFill>
+                        <a:ln w="0">
+                          <a:noFill/>
+                        </a:ln>
                       </wps:spPr>
+                      <wps:style>
+                        <a:lnRef idx="0"/>
+                        <a:fillRef idx="0"/>
+                        <a:effectRef idx="0"/>
+                        <a:fontRef idx="minor"/>
+                      </wps:style>
                       <wps:txbx>
                         <w:txbxContent>
                           <w:p>
@@ -950,7 +1015,7 @@
                               <w:pStyle w:val="Figure"/>
                               <w:bidi w:val="0"/>
                               <w:spacing w:before="120" w:after="120"/>
-                              <w:jc w:val="start"/>
+                              <w:jc w:val="left"/>
                               <w:rPr/>
                             </w:pPr>
                             <w:r>
@@ -959,7 +1024,7 @@
                                 <wp:inline distT="0" distB="0" distL="0" distR="0">
                                   <wp:extent cx="6332220" cy="151765"/>
                                   <wp:effectExtent l="0" t="0" r="0" b="0"/>
-                                  <wp:docPr id="11" name="Image4"/>
+                                  <wp:docPr id="6" name="Image4" descr=""/>
                                   <wp:cNvGraphicFramePr>
                                     <a:graphicFrameLocks xmlns:a="http://schemas.openxmlformats.org/drawingml/2006/main" noChangeAspect="1"/>
                                   </wp:cNvGraphicFramePr>
@@ -967,7 +1032,7 @@
                                     <a:graphicData uri="http://schemas.openxmlformats.org/drawingml/2006/picture">
                                       <pic:pic xmlns:pic="http://schemas.openxmlformats.org/drawingml/2006/picture">
                                         <pic:nvPicPr>
-                                          <pic:cNvPr id="11" name="Image4"/>
+                                          <pic:cNvPr id="6" name="Image4" descr=""/>
                                           <pic:cNvPicPr>
                                             <a:picLocks noChangeAspect="1" noChangeArrowheads="1"/>
                                           </pic:cNvPicPr>
@@ -986,13 +1051,15 @@
                                           <a:prstGeom prst="rect">
                                             <a:avLst/>
                                           </a:prstGeom>
-                                          <a:noFill/>
                                         </pic:spPr>
                                       </pic:pic>
                                     </a:graphicData>
                                   </a:graphic>
                                 </wp:inline>
                               </w:drawing>
+                            </w:r>
+                            <w:r>
+                              <w:rPr/>
                               <w:t xml:space="preserve">Figure </w:t>
                             </w:r>
                             <w:r>
@@ -1022,7 +1089,7 @@
                           </w:p>
                         </w:txbxContent>
                       </wps:txbx>
-                      <wps:bodyPr anchor="t" lIns="0" tIns="0" rIns="0" bIns="0">
+                      <wps:bodyPr lIns="0" rIns="0" tIns="0" bIns="0" anchor="t">
                         <a:noAutofit/>
                       </wps:bodyPr>
                     </wps:wsp>
@@ -1033,15 +1100,17 @@
           </mc:Choice>
           <mc:Fallback>
             <w:pict>
-              <v:rect style="position:absolute;rotation:-0;width:498.6pt;height:31.75pt;mso-wrap-distance-left:0pt;mso-wrap-distance-right:0pt;mso-wrap-distance-top:0pt;mso-wrap-distance-bottom:0pt;margin-top:0pt;mso-position-vertical:top;mso-position-vertical-relative:text;margin-left:0pt;mso-position-horizontal:center;mso-position-horizontal-relative:text">
-                <v:textbox inset="0in,0in,0in,0in">
+              <v:rect id="shape_0" ID="Frame4" path="m0,0l-2147483645,0l-2147483645,-2147483646l0,-2147483646xe" fillcolor="white" stroked="f" o:allowincell="f" style="position:absolute;margin-left:0pt;margin-top:0.05pt;width:498.55pt;height:31.7pt;mso-wrap-style:square;v-text-anchor:top;mso-position-horizontal:center">
+                <v:fill o:detectmouseclick="t" type="solid" color2="black"/>
+                <v:stroke color="#3465a4" joinstyle="round" endcap="flat"/>
+                <v:textbox>
                   <w:txbxContent>
                     <w:p>
                       <w:pPr>
                         <w:pStyle w:val="Figure"/>
                         <w:bidi w:val="0"/>
                         <w:spacing w:before="120" w:after="120"/>
-                        <w:jc w:val="start"/>
+                        <w:jc w:val="left"/>
                         <w:rPr/>
                       </w:pPr>
                       <w:r>
@@ -1050,7 +1119,7 @@
                           <wp:inline distT="0" distB="0" distL="0" distR="0">
                             <wp:extent cx="6332220" cy="151765"/>
                             <wp:effectExtent l="0" t="0" r="0" b="0"/>
-                            <wp:docPr id="12" name="Image4"/>
+                            <wp:docPr id="7" name="Image4" descr=""/>
                             <wp:cNvGraphicFramePr>
                               <a:graphicFrameLocks xmlns:a="http://schemas.openxmlformats.org/drawingml/2006/main" noChangeAspect="1"/>
                             </wp:cNvGraphicFramePr>
@@ -1058,7 +1127,7 @@
                               <a:graphicData uri="http://schemas.openxmlformats.org/drawingml/2006/picture">
                                 <pic:pic xmlns:pic="http://schemas.openxmlformats.org/drawingml/2006/picture">
                                   <pic:nvPicPr>
-                                    <pic:cNvPr id="12" name="Image4"/>
+                                    <pic:cNvPr id="7" name="Image4" descr=""/>
                                     <pic:cNvPicPr>
                                       <a:picLocks noChangeAspect="1" noChangeArrowheads="1"/>
                                     </pic:cNvPicPr>
@@ -1077,13 +1146,15 @@
                                     <a:prstGeom prst="rect">
                                       <a:avLst/>
                                     </a:prstGeom>
-                                    <a:noFill/>
                                   </pic:spPr>
                                 </pic:pic>
                               </a:graphicData>
                             </a:graphic>
                           </wp:inline>
                         </w:drawing>
+                      </w:r>
+                      <w:r>
+                        <w:rPr/>
                         <w:t xml:space="preserve">Figure </w:t>
                       </w:r>
                       <w:r>
@@ -1169,12 +1240,10 @@
       </w:pPr>
       <w:r>
         <w:rPr/>
-      </w:r>
-      <w:r>
         <mc:AlternateContent>
           <mc:Choice Requires="wps">
             <w:drawing>
-              <wp:anchor distT="0" distB="0" distL="0" distR="0" simplePos="0" relativeHeight="10" behindDoc="0" locked="0" layoutInCell="0" allowOverlap="1">
+              <wp:anchor behindDoc="0" distT="0" distB="0" distL="0" distR="0" simplePos="0" locked="0" layoutInCell="0" allowOverlap="1" relativeHeight="12">
                 <wp:simplePos x="0" y="0"/>
                 <wp:positionH relativeFrom="column">
                   <wp:align>center</wp:align>
@@ -1185,21 +1254,32 @@
                 <wp:extent cx="5858510" cy="1394460"/>
                 <wp:effectExtent l="0" t="0" r="0" b="0"/>
                 <wp:wrapSquare wrapText="largest"/>
-                <wp:docPr id="13" name="Frame5"/>
+                <wp:docPr id="5" name="Frame5"/>
                 <a:graphic xmlns:a="http://schemas.openxmlformats.org/drawingml/2006/main">
                   <a:graphicData uri="http://schemas.microsoft.com/office/word/2010/wordprocessingShape">
                     <wps:wsp>
-                      <wps:cNvSpPr txBox="1"/>
+                      <wps:cNvSpPr/>
                       <wps:spPr>
                         <a:xfrm>
                           <a:off x="0" y="0"/>
-                          <a:ext cx="5858510" cy="1394460"/>
+                          <a:ext cx="5858640" cy="1394640"/>
                         </a:xfrm>
-                        <a:prstGeom prst="rect"/>
+                        <a:prstGeom prst="rect">
+                          <a:avLst/>
+                        </a:prstGeom>
                         <a:solidFill>
-                          <a:srgbClr val="FFFFFF"/>
+                          <a:srgbClr val="ffffff"/>
                         </a:solidFill>
+                        <a:ln w="0">
+                          <a:noFill/>
+                        </a:ln>
                       </wps:spPr>
+                      <wps:style>
+                        <a:lnRef idx="0"/>
+                        <a:fillRef idx="0"/>
+                        <a:effectRef idx="0"/>
+                        <a:fontRef idx="minor"/>
+                      </wps:style>
                       <wps:txbx>
                         <w:txbxContent>
                           <w:p>
@@ -1207,7 +1287,7 @@
                               <w:pStyle w:val="Figure"/>
                               <w:bidi w:val="0"/>
                               <w:spacing w:before="120" w:after="120"/>
-                              <w:jc w:val="start"/>
+                              <w:jc w:val="left"/>
                               <w:rPr/>
                             </w:pPr>
                             <w:r>
@@ -1216,7 +1296,7 @@
                                 <wp:inline distT="0" distB="0" distL="0" distR="0">
                                   <wp:extent cx="5858510" cy="1143000"/>
                                   <wp:effectExtent l="0" t="0" r="0" b="0"/>
-                                  <wp:docPr id="14" name="Image5"/>
+                                  <wp:docPr id="7" name="Image5" descr=""/>
                                   <wp:cNvGraphicFramePr>
                                     <a:graphicFrameLocks xmlns:a="http://schemas.openxmlformats.org/drawingml/2006/main" noChangeAspect="1"/>
                                   </wp:cNvGraphicFramePr>
@@ -1224,7 +1304,7 @@
                                     <a:graphicData uri="http://schemas.openxmlformats.org/drawingml/2006/picture">
                                       <pic:pic xmlns:pic="http://schemas.openxmlformats.org/drawingml/2006/picture">
                                         <pic:nvPicPr>
-                                          <pic:cNvPr id="14" name="Image5"/>
+                                          <pic:cNvPr id="7" name="Image5" descr=""/>
                                           <pic:cNvPicPr>
                                             <a:picLocks noChangeAspect="1" noChangeArrowheads="1"/>
                                           </pic:cNvPicPr>
@@ -1243,13 +1323,15 @@
                                           <a:prstGeom prst="rect">
                                             <a:avLst/>
                                           </a:prstGeom>
-                                          <a:noFill/>
                                         </pic:spPr>
                                       </pic:pic>
                                     </a:graphicData>
                                   </a:graphic>
                                 </wp:inline>
                               </w:drawing>
+                            </w:r>
+                            <w:r>
+                              <w:rPr/>
                               <w:t xml:space="preserve">Figure </w:t>
                             </w:r>
                             <w:r>
@@ -1279,7 +1361,7 @@
                           </w:p>
                         </w:txbxContent>
                       </wps:txbx>
-                      <wps:bodyPr anchor="t" lIns="0" tIns="0" rIns="0" bIns="0">
+                      <wps:bodyPr lIns="0" rIns="0" tIns="0" bIns="0" anchor="t">
                         <a:noAutofit/>
                       </wps:bodyPr>
                     </wps:wsp>
@@ -1290,15 +1372,17 @@
           </mc:Choice>
           <mc:Fallback>
             <w:pict>
-              <v:rect style="position:absolute;rotation:-0;width:461.3pt;height:109.8pt;mso-wrap-distance-left:0pt;mso-wrap-distance-right:0pt;mso-wrap-distance-top:0pt;mso-wrap-distance-bottom:0pt;margin-top:0pt;mso-position-vertical:top;mso-position-vertical-relative:text;margin-left:18.65pt;mso-position-horizontal:center;mso-position-horizontal-relative:text">
-                <v:textbox inset="0in,0in,0in,0in">
+              <v:rect id="shape_0" ID="Frame5" path="m0,0l-2147483645,0l-2147483645,-2147483646l0,-2147483646xe" fillcolor="white" stroked="f" o:allowincell="f" style="position:absolute;margin-left:18.65pt;margin-top:0.05pt;width:461.25pt;height:109.75pt;mso-wrap-style:square;v-text-anchor:top;mso-position-horizontal:center">
+                <v:fill o:detectmouseclick="t" type="solid" color2="black"/>
+                <v:stroke color="#3465a4" joinstyle="round" endcap="flat"/>
+                <v:textbox>
                   <w:txbxContent>
                     <w:p>
                       <w:pPr>
                         <w:pStyle w:val="Figure"/>
                         <w:bidi w:val="0"/>
                         <w:spacing w:before="120" w:after="120"/>
-                        <w:jc w:val="start"/>
+                        <w:jc w:val="left"/>
                         <w:rPr/>
                       </w:pPr>
                       <w:r>
@@ -1307,7 +1391,7 @@
                           <wp:inline distT="0" distB="0" distL="0" distR="0">
                             <wp:extent cx="5858510" cy="1143000"/>
                             <wp:effectExtent l="0" t="0" r="0" b="0"/>
-                            <wp:docPr id="15" name="Image5"/>
+                            <wp:docPr id="8" name="Image5" descr=""/>
                             <wp:cNvGraphicFramePr>
                               <a:graphicFrameLocks xmlns:a="http://schemas.openxmlformats.org/drawingml/2006/main" noChangeAspect="1"/>
                             </wp:cNvGraphicFramePr>
@@ -1315,7 +1399,7 @@
                               <a:graphicData uri="http://schemas.openxmlformats.org/drawingml/2006/picture">
                                 <pic:pic xmlns:pic="http://schemas.openxmlformats.org/drawingml/2006/picture">
                                   <pic:nvPicPr>
-                                    <pic:cNvPr id="15" name="Image5"/>
+                                    <pic:cNvPr id="8" name="Image5" descr=""/>
                                     <pic:cNvPicPr>
                                       <a:picLocks noChangeAspect="1" noChangeArrowheads="1"/>
                                     </pic:cNvPicPr>
@@ -1334,13 +1418,15 @@
                                     <a:prstGeom prst="rect">
                                       <a:avLst/>
                                     </a:prstGeom>
-                                    <a:noFill/>
                                   </pic:spPr>
                                 </pic:pic>
                               </a:graphicData>
                             </a:graphic>
                           </wp:inline>
                         </w:drawing>
+                      </w:r>
+                      <w:r>
+                        <w:rPr/>
                         <w:t xml:space="preserve">Figure </w:t>
                       </w:r>
                       <w:r>
@@ -1380,18 +1466,18 @@
     <w:p>
       <w:pPr>
         <w:pStyle w:val="Heading1"/>
-        <w:bidi w:val="0"/>
-        <w:ind w:hanging="0" w:start="0"/>
-        <w:jc w:val="start"/>
-        <w:rPr/>
-      </w:pPr>
-      <w:r>
-        <w:rPr/>
-        <w:t xml:space="preserve">3. </w:t>
-      </w:r>
-      <w:r>
-        <w:rPr/>
-        <w:t xml:space="preserve">Simple </w:t>
+        <w:numPr>
+          <w:ilvl w:val="0"/>
+          <w:numId w:val="2"/>
+        </w:numPr>
+        <w:bidi w:val="0"/>
+        <w:ind w:hanging="0" w:left="0"/>
+        <w:jc w:val="left"/>
+        <w:rPr/>
+      </w:pPr>
+      <w:r>
+        <w:rPr/>
+        <w:t xml:space="preserve">3. Simple </w:t>
       </w:r>
       <w:r>
         <w:rPr>
@@ -1423,7 +1509,11 @@
           <w:b/>
           <w:bCs/>
         </w:rPr>
-        <w:t>output</w:t>
+        <w:t>output,</w:t>
+      </w:r>
+      <w:r>
+        <w:rPr/>
+        <w:t xml:space="preserve"> </w:t>
       </w:r>
       <w:r>
         <w:rPr>
@@ -1431,27 +1521,7 @@
           <w:b/>
           <w:bCs/>
         </w:rPr>
-        <w:t>,</w:t>
-      </w:r>
-      <w:r>
-        <w:rPr/>
-        <w:t xml:space="preserve"> </w:t>
-      </w:r>
-      <w:r>
-        <w:rPr>
-          <w:rStyle w:val="Strong"/>
-          <w:b/>
-          <w:bCs/>
-        </w:rPr>
-        <w:t>testbench</w:t>
-      </w:r>
-      <w:r>
-        <w:rPr>
-          <w:rStyle w:val="Strong"/>
-          <w:b/>
-          <w:bCs/>
-        </w:rPr>
-        <w:t xml:space="preserve"> và check wave ( gtkwave )</w:t>
+        <w:t>testbench và check wave ( gtkwave )</w:t>
       </w:r>
     </w:p>
     <w:p>
@@ -1473,12 +1543,10 @@
       </w:pPr>
       <w:r>
         <w:rPr/>
-      </w:r>
-      <w:r>
         <mc:AlternateContent>
           <mc:Choice Requires="wps">
             <w:drawing>
-              <wp:anchor distT="0" distB="0" distL="0" distR="0" simplePos="0" relativeHeight="12" behindDoc="0" locked="0" layoutInCell="0" allowOverlap="1">
+              <wp:anchor behindDoc="0" distT="0" distB="0" distL="0" distR="0" simplePos="0" locked="0" layoutInCell="0" allowOverlap="1" relativeHeight="14">
                 <wp:simplePos x="0" y="0"/>
                 <wp:positionH relativeFrom="column">
                   <wp:align>center</wp:align>
@@ -1489,21 +1557,32 @@
                 <wp:extent cx="4696460" cy="2680335"/>
                 <wp:effectExtent l="0" t="0" r="0" b="0"/>
                 <wp:wrapSquare wrapText="largest"/>
-                <wp:docPr id="16" name="Frame6"/>
+                <wp:docPr id="6" name="Frame6"/>
                 <a:graphic xmlns:a="http://schemas.openxmlformats.org/drawingml/2006/main">
                   <a:graphicData uri="http://schemas.microsoft.com/office/word/2010/wordprocessingShape">
                     <wps:wsp>
-                      <wps:cNvSpPr txBox="1"/>
+                      <wps:cNvSpPr/>
                       <wps:spPr>
                         <a:xfrm>
                           <a:off x="0" y="0"/>
-                          <a:ext cx="4696460" cy="2680335"/>
+                          <a:ext cx="4696560" cy="2680200"/>
                         </a:xfrm>
-                        <a:prstGeom prst="rect"/>
+                        <a:prstGeom prst="rect">
+                          <a:avLst/>
+                        </a:prstGeom>
                         <a:solidFill>
-                          <a:srgbClr val="FFFFFF"/>
+                          <a:srgbClr val="ffffff"/>
                         </a:solidFill>
+                        <a:ln w="0">
+                          <a:noFill/>
+                        </a:ln>
                       </wps:spPr>
+                      <wps:style>
+                        <a:lnRef idx="0"/>
+                        <a:fillRef idx="0"/>
+                        <a:effectRef idx="0"/>
+                        <a:fontRef idx="minor"/>
+                      </wps:style>
                       <wps:txbx>
                         <w:txbxContent>
                           <w:p>
@@ -1511,7 +1590,7 @@
                               <w:pStyle w:val="Figure"/>
                               <w:bidi w:val="0"/>
                               <w:spacing w:before="120" w:after="120"/>
-                              <w:jc w:val="start"/>
+                              <w:jc w:val="left"/>
                               <w:rPr/>
                             </w:pPr>
                             <w:r>
@@ -1520,7 +1599,7 @@
                                 <wp:inline distT="0" distB="0" distL="0" distR="0">
                                   <wp:extent cx="4696460" cy="2428875"/>
                                   <wp:effectExtent l="0" t="0" r="0" b="0"/>
-                                  <wp:docPr id="17" name="Image6"/>
+                                  <wp:docPr id="8" name="Image6" descr=""/>
                                   <wp:cNvGraphicFramePr>
                                     <a:graphicFrameLocks xmlns:a="http://schemas.openxmlformats.org/drawingml/2006/main" noChangeAspect="1"/>
                                   </wp:cNvGraphicFramePr>
@@ -1528,7 +1607,7 @@
                                     <a:graphicData uri="http://schemas.openxmlformats.org/drawingml/2006/picture">
                                       <pic:pic xmlns:pic="http://schemas.openxmlformats.org/drawingml/2006/picture">
                                         <pic:nvPicPr>
-                                          <pic:cNvPr id="17" name="Image6"/>
+                                          <pic:cNvPr id="8" name="Image6" descr=""/>
                                           <pic:cNvPicPr>
                                             <a:picLocks noChangeAspect="1" noChangeArrowheads="1"/>
                                           </pic:cNvPicPr>
@@ -1547,13 +1626,15 @@
                                           <a:prstGeom prst="rect">
                                             <a:avLst/>
                                           </a:prstGeom>
-                                          <a:noFill/>
                                         </pic:spPr>
                                       </pic:pic>
                                     </a:graphicData>
                                   </a:graphic>
                                 </wp:inline>
                               </w:drawing>
+                            </w:r>
+                            <w:r>
+                              <w:rPr/>
                               <w:t xml:space="preserve">Figure </w:t>
                             </w:r>
                             <w:r>
@@ -1583,7 +1664,7 @@
                           </w:p>
                         </w:txbxContent>
                       </wps:txbx>
-                      <wps:bodyPr anchor="t" lIns="0" tIns="0" rIns="0" bIns="0">
+                      <wps:bodyPr lIns="0" rIns="0" tIns="0" bIns="0" anchor="t">
                         <a:noAutofit/>
                       </wps:bodyPr>
                     </wps:wsp>
@@ -1594,15 +1675,17 @@
           </mc:Choice>
           <mc:Fallback>
             <w:pict>
-              <v:rect style="position:absolute;rotation:-0;width:369.8pt;height:211.05pt;mso-wrap-distance-left:0pt;mso-wrap-distance-right:0pt;mso-wrap-distance-top:0pt;mso-wrap-distance-bottom:0pt;margin-top:0pt;mso-position-vertical:top;mso-position-vertical-relative:text;margin-left:64.4pt;mso-position-horizontal:center;mso-position-horizontal-relative:text">
-                <v:textbox inset="0in,0in,0in,0in">
+              <v:rect id="shape_0" ID="Frame6" path="m0,0l-2147483645,0l-2147483645,-2147483646l0,-2147483646xe" fillcolor="white" stroked="f" o:allowincell="f" style="position:absolute;margin-left:64.4pt;margin-top:0.05pt;width:369.75pt;height:211pt;mso-wrap-style:square;v-text-anchor:top;mso-position-horizontal:center">
+                <v:fill o:detectmouseclick="t" type="solid" color2="black"/>
+                <v:stroke color="#3465a4" joinstyle="round" endcap="flat"/>
+                <v:textbox>
                   <w:txbxContent>
                     <w:p>
                       <w:pPr>
                         <w:pStyle w:val="Figure"/>
                         <w:bidi w:val="0"/>
                         <w:spacing w:before="120" w:after="120"/>
-                        <w:jc w:val="start"/>
+                        <w:jc w:val="left"/>
                         <w:rPr/>
                       </w:pPr>
                       <w:r>
@@ -1611,7 +1694,7 @@
                           <wp:inline distT="0" distB="0" distL="0" distR="0">
                             <wp:extent cx="4696460" cy="2428875"/>
                             <wp:effectExtent l="0" t="0" r="0" b="0"/>
-                            <wp:docPr id="18" name="Image6"/>
+                            <wp:docPr id="9" name="Image6" descr=""/>
                             <wp:cNvGraphicFramePr>
                               <a:graphicFrameLocks xmlns:a="http://schemas.openxmlformats.org/drawingml/2006/main" noChangeAspect="1"/>
                             </wp:cNvGraphicFramePr>
@@ -1619,7 +1702,7 @@
                               <a:graphicData uri="http://schemas.openxmlformats.org/drawingml/2006/picture">
                                 <pic:pic xmlns:pic="http://schemas.openxmlformats.org/drawingml/2006/picture">
                                   <pic:nvPicPr>
-                                    <pic:cNvPr id="18" name="Image6"/>
+                                    <pic:cNvPr id="9" name="Image6" descr=""/>
                                     <pic:cNvPicPr>
                                       <a:picLocks noChangeAspect="1" noChangeArrowheads="1"/>
                                     </pic:cNvPicPr>
@@ -1638,13 +1721,15 @@
                                     <a:prstGeom prst="rect">
                                       <a:avLst/>
                                     </a:prstGeom>
-                                    <a:noFill/>
                                   </pic:spPr>
                                 </pic:pic>
                               </a:graphicData>
                             </a:graphic>
                           </wp:inline>
                         </w:drawing>
+                      </w:r>
+                      <w:r>
+                        <w:rPr/>
                         <w:t xml:space="preserve">Figure </w:t>
                       </w:r>
                       <w:r>
@@ -1779,12 +1864,10 @@
       </w:pPr>
       <w:r>
         <w:rPr/>
-      </w:r>
-      <w:r>
         <mc:AlternateContent>
           <mc:Choice Requires="wps">
             <w:drawing>
-              <wp:anchor distT="0" distB="0" distL="0" distR="0" simplePos="0" relativeHeight="14" behindDoc="0" locked="0" layoutInCell="0" allowOverlap="1">
+              <wp:anchor behindDoc="0" distT="0" distB="0" distL="0" distR="0" simplePos="0" locked="0" layoutInCell="0" allowOverlap="1" relativeHeight="17">
                 <wp:simplePos x="0" y="0"/>
                 <wp:positionH relativeFrom="column">
                   <wp:align>center</wp:align>
@@ -1795,21 +1878,32 @@
                 <wp:extent cx="6332220" cy="5748655"/>
                 <wp:effectExtent l="0" t="0" r="0" b="0"/>
                 <wp:wrapSquare wrapText="largest"/>
-                <wp:docPr id="19" name="Frame7"/>
+                <wp:docPr id="7" name="Frame7"/>
                 <a:graphic xmlns:a="http://schemas.openxmlformats.org/drawingml/2006/main">
                   <a:graphicData uri="http://schemas.microsoft.com/office/word/2010/wordprocessingShape">
                     <wps:wsp>
-                      <wps:cNvSpPr txBox="1"/>
+                      <wps:cNvSpPr/>
                       <wps:spPr>
                         <a:xfrm>
                           <a:off x="0" y="0"/>
-                          <a:ext cx="6332220" cy="5748655"/>
+                          <a:ext cx="6332400" cy="5748480"/>
                         </a:xfrm>
-                        <a:prstGeom prst="rect"/>
+                        <a:prstGeom prst="rect">
+                          <a:avLst/>
+                        </a:prstGeom>
                         <a:solidFill>
-                          <a:srgbClr val="FFFFFF"/>
+                          <a:srgbClr val="ffffff"/>
                         </a:solidFill>
+                        <a:ln w="0">
+                          <a:noFill/>
+                        </a:ln>
                       </wps:spPr>
+                      <wps:style>
+                        <a:lnRef idx="0"/>
+                        <a:fillRef idx="0"/>
+                        <a:effectRef idx="0"/>
+                        <a:fontRef idx="minor"/>
+                      </wps:style>
                       <wps:txbx>
                         <w:txbxContent>
                           <w:p>
@@ -1817,7 +1911,7 @@
                               <w:pStyle w:val="Figure"/>
                               <w:bidi w:val="0"/>
                               <w:spacing w:before="120" w:after="120"/>
-                              <w:jc w:val="start"/>
+                              <w:jc w:val="left"/>
                               <w:rPr/>
                             </w:pPr>
                             <w:r>
@@ -1826,7 +1920,7 @@
                                 <wp:inline distT="0" distB="0" distL="0" distR="0">
                                   <wp:extent cx="6332220" cy="5321935"/>
                                   <wp:effectExtent l="0" t="0" r="0" b="0"/>
-                                  <wp:docPr id="20" name="Image7"/>
+                                  <wp:docPr id="9" name="Image7" descr=""/>
                                   <wp:cNvGraphicFramePr>
                                     <a:graphicFrameLocks xmlns:a="http://schemas.openxmlformats.org/drawingml/2006/main" noChangeAspect="1"/>
                                   </wp:cNvGraphicFramePr>
@@ -1834,7 +1928,7 @@
                                     <a:graphicData uri="http://schemas.openxmlformats.org/drawingml/2006/picture">
                                       <pic:pic xmlns:pic="http://schemas.openxmlformats.org/drawingml/2006/picture">
                                         <pic:nvPicPr>
-                                          <pic:cNvPr id="20" name="Image7"/>
+                                          <pic:cNvPr id="9" name="Image7" descr=""/>
                                           <pic:cNvPicPr>
                                             <a:picLocks noChangeAspect="1" noChangeArrowheads="1"/>
                                           </pic:cNvPicPr>
@@ -1853,13 +1947,15 @@
                                           <a:prstGeom prst="rect">
                                             <a:avLst/>
                                           </a:prstGeom>
-                                          <a:noFill/>
                                         </pic:spPr>
                                       </pic:pic>
                                     </a:graphicData>
                                   </a:graphic>
                                 </wp:inline>
                               </w:drawing>
+                            </w:r>
+                            <w:r>
+                              <w:rPr/>
                               <w:t xml:space="preserve">Figure </w:t>
                             </w:r>
                             <w:r>
@@ -1884,24 +1980,12 @@
                             </w:r>
                             <w:r>
                               <w:rPr/>
-                              <w:t xml:space="preserve">: gate_testbench_with_wave.v thêm 1 đoạn </w:t>
-                            </w:r>
-                            <w:r>
-                              <w:rPr/>
-                              <w:t xml:space="preserve">code(1) </w:t>
-                            </w:r>
-                            <w:r>
-                              <w:rPr/>
-                              <w:t xml:space="preserve">để output ra file "and_gate_wave.vcd" để dùng check đồ thì trên </w:t>
-                            </w:r>
-                            <w:r>
-                              <w:rPr/>
-                              <w:t>gtkwave, lưu ý module_name phải trùng với $dumpvars(2)</w:t>
+                              <w:t>: gate_testbench_with_wave.v thêm 1 đoạn code(1) để output ra file "and_gate_wave.vcd" để dùng check đồ thì trên gtkwave, lưu ý module_name phải trùng với $dumpvars(2)</w:t>
                             </w:r>
                           </w:p>
                         </w:txbxContent>
                       </wps:txbx>
-                      <wps:bodyPr anchor="t" lIns="0" tIns="0" rIns="0" bIns="0">
+                      <wps:bodyPr lIns="0" rIns="0" tIns="0" bIns="0" anchor="t">
                         <a:noAutofit/>
                       </wps:bodyPr>
                     </wps:wsp>
@@ -1912,15 +1996,17 @@
           </mc:Choice>
           <mc:Fallback>
             <w:pict>
-              <v:rect style="position:absolute;rotation:-0;width:498.6pt;height:452.65pt;mso-wrap-distance-left:0pt;mso-wrap-distance-right:0pt;mso-wrap-distance-top:0pt;mso-wrap-distance-bottom:0pt;margin-top:0pt;mso-position-vertical:top;mso-position-vertical-relative:text;margin-left:0pt;mso-position-horizontal:center;mso-position-horizontal-relative:text">
-                <v:textbox inset="0in,0in,0in,0in">
+              <v:rect id="shape_0" ID="Frame7" path="m0,0l-2147483645,0l-2147483645,-2147483646l0,-2147483646xe" fillcolor="white" stroked="f" o:allowincell="f" style="position:absolute;margin-left:0pt;margin-top:0.05pt;width:498.55pt;height:452.6pt;mso-wrap-style:square;v-text-anchor:top;mso-position-horizontal:center">
+                <v:fill o:detectmouseclick="t" type="solid" color2="black"/>
+                <v:stroke color="#3465a4" joinstyle="round" endcap="flat"/>
+                <v:textbox>
                   <w:txbxContent>
                     <w:p>
                       <w:pPr>
                         <w:pStyle w:val="Figure"/>
                         <w:bidi w:val="0"/>
                         <w:spacing w:before="120" w:after="120"/>
-                        <w:jc w:val="start"/>
+                        <w:jc w:val="left"/>
                         <w:rPr/>
                       </w:pPr>
                       <w:r>
@@ -1929,7 +2015,7 @@
                           <wp:inline distT="0" distB="0" distL="0" distR="0">
                             <wp:extent cx="6332220" cy="5321935"/>
                             <wp:effectExtent l="0" t="0" r="0" b="0"/>
-                            <wp:docPr id="21" name="Image7"/>
+                            <wp:docPr id="10" name="Image7" descr=""/>
                             <wp:cNvGraphicFramePr>
                               <a:graphicFrameLocks xmlns:a="http://schemas.openxmlformats.org/drawingml/2006/main" noChangeAspect="1"/>
                             </wp:cNvGraphicFramePr>
@@ -1937,7 +2023,7 @@
                               <a:graphicData uri="http://schemas.openxmlformats.org/drawingml/2006/picture">
                                 <pic:pic xmlns:pic="http://schemas.openxmlformats.org/drawingml/2006/picture">
                                   <pic:nvPicPr>
-                                    <pic:cNvPr id="21" name="Image7"/>
+                                    <pic:cNvPr id="10" name="Image7" descr=""/>
                                     <pic:cNvPicPr>
                                       <a:picLocks noChangeAspect="1" noChangeArrowheads="1"/>
                                     </pic:cNvPicPr>
@@ -1956,13 +2042,15 @@
                                     <a:prstGeom prst="rect">
                                       <a:avLst/>
                                     </a:prstGeom>
-                                    <a:noFill/>
                                   </pic:spPr>
                                 </pic:pic>
                               </a:graphicData>
                             </a:graphic>
                           </wp:inline>
                         </w:drawing>
+                      </w:r>
+                      <w:r>
+                        <w:rPr/>
                         <w:t xml:space="preserve">Figure </w:t>
                       </w:r>
                       <w:r>
@@ -1987,19 +2075,7 @@
                       </w:r>
                       <w:r>
                         <w:rPr/>
-                        <w:t xml:space="preserve">: gate_testbench_with_wave.v thêm 1 đoạn </w:t>
-                      </w:r>
-                      <w:r>
-                        <w:rPr/>
-                        <w:t xml:space="preserve">code(1) </w:t>
-                      </w:r>
-                      <w:r>
-                        <w:rPr/>
-                        <w:t xml:space="preserve">để output ra file "and_gate_wave.vcd" để dùng check đồ thì trên </w:t>
-                      </w:r>
-                      <w:r>
-                        <w:rPr/>
-                        <w:t>gtkwave, lưu ý module_name phải trùng với $dumpvars(2)</w:t>
+                        <w:t>: gate_testbench_with_wave.v thêm 1 đoạn code(1) để output ra file "and_gate_wave.vcd" để dùng check đồ thì trên gtkwave, lưu ý module_name phải trùng với $dumpvars(2)</w:t>
                       </w:r>
                     </w:p>
                   </w:txbxContent>
@@ -2031,7 +2107,7 @@
       <w:r>
         <w:rPr/>
         <w:drawing>
-          <wp:anchor distT="0" distB="0" distL="0" distR="0" simplePos="0" relativeHeight="16" behindDoc="0" locked="0" layoutInCell="0" allowOverlap="1">
+          <wp:anchor behindDoc="0" distT="0" distB="0" distL="0" distR="0" simplePos="0" locked="0" layoutInCell="0" allowOverlap="1" relativeHeight="19">
             <wp:simplePos x="0" y="0"/>
             <wp:positionH relativeFrom="column">
               <wp:align>center</wp:align>
@@ -2042,7 +2118,7 @@
             <wp:extent cx="6332220" cy="253365"/>
             <wp:effectExtent l="0" t="0" r="0" b="0"/>
             <wp:wrapSquare wrapText="largest"/>
-            <wp:docPr id="22" name="Image8"/>
+            <wp:docPr id="8" name="Image8" descr=""/>
             <wp:cNvGraphicFramePr>
               <a:graphicFrameLocks xmlns:a="http://schemas.openxmlformats.org/drawingml/2006/main" noChangeAspect="1"/>
             </wp:cNvGraphicFramePr>
@@ -2050,7 +2126,7 @@
               <a:graphicData uri="http://schemas.openxmlformats.org/drawingml/2006/picture">
                 <pic:pic xmlns:pic="http://schemas.openxmlformats.org/drawingml/2006/picture">
                   <pic:nvPicPr>
-                    <pic:cNvPr id="22" name="Image8"/>
+                    <pic:cNvPr id="8" name="Image8" descr=""/>
                     <pic:cNvPicPr>
                       <a:picLocks noChangeAspect="1" noChangeArrowheads="1"/>
                     </pic:cNvPicPr>
@@ -2069,7 +2145,6 @@
                     <a:prstGeom prst="rect">
                       <a:avLst/>
                     </a:prstGeom>
-                    <a:noFill/>
                   </pic:spPr>
                 </pic:pic>
               </a:graphicData>
@@ -2158,7 +2233,7 @@
       <w:r>
         <w:rPr/>
         <w:drawing>
-          <wp:anchor distT="0" distB="0" distL="0" distR="0" simplePos="0" relativeHeight="17" behindDoc="0" locked="0" layoutInCell="0" allowOverlap="1">
+          <wp:anchor behindDoc="0" distT="0" distB="0" distL="0" distR="0" simplePos="0" locked="0" layoutInCell="0" allowOverlap="1" relativeHeight="20">
             <wp:simplePos x="0" y="0"/>
             <wp:positionH relativeFrom="column">
               <wp:align>center</wp:align>
@@ -2169,7 +2244,7 @@
             <wp:extent cx="6332220" cy="1322070"/>
             <wp:effectExtent l="0" t="0" r="0" b="0"/>
             <wp:wrapSquare wrapText="largest"/>
-            <wp:docPr id="23" name="Image9"/>
+            <wp:docPr id="9" name="Image9" descr=""/>
             <wp:cNvGraphicFramePr>
               <a:graphicFrameLocks xmlns:a="http://schemas.openxmlformats.org/drawingml/2006/main" noChangeAspect="1"/>
             </wp:cNvGraphicFramePr>
@@ -2177,7 +2252,7 @@
               <a:graphicData uri="http://schemas.openxmlformats.org/drawingml/2006/picture">
                 <pic:pic xmlns:pic="http://schemas.openxmlformats.org/drawingml/2006/picture">
                   <pic:nvPicPr>
-                    <pic:cNvPr id="23" name="Image9"/>
+                    <pic:cNvPr id="9" name="Image9" descr=""/>
                     <pic:cNvPicPr>
                       <a:picLocks noChangeAspect="1" noChangeArrowheads="1"/>
                     </pic:cNvPicPr>
@@ -2196,7 +2271,6 @@
                     <a:prstGeom prst="rect">
                       <a:avLst/>
                     </a:prstGeom>
-                    <a:noFill/>
                   </pic:spPr>
                 </pic:pic>
               </a:graphicData>
@@ -2235,7 +2309,7 @@
       <w:r>
         <w:rPr/>
         <w:drawing>
-          <wp:anchor distT="0" distB="0" distL="0" distR="0" simplePos="0" relativeHeight="18" behindDoc="0" locked="0" layoutInCell="0" allowOverlap="1">
+          <wp:anchor behindDoc="0" distT="0" distB="0" distL="0" distR="0" simplePos="0" locked="0" layoutInCell="0" allowOverlap="1" relativeHeight="21">
             <wp:simplePos x="0" y="0"/>
             <wp:positionH relativeFrom="column">
               <wp:align>center</wp:align>
@@ -2246,7 +2320,7 @@
             <wp:extent cx="6332220" cy="1148080"/>
             <wp:effectExtent l="0" t="0" r="0" b="0"/>
             <wp:wrapSquare wrapText="largest"/>
-            <wp:docPr id="24" name="Image10"/>
+            <wp:docPr id="10" name="Image10" descr=""/>
             <wp:cNvGraphicFramePr>
               <a:graphicFrameLocks xmlns:a="http://schemas.openxmlformats.org/drawingml/2006/main" noChangeAspect="1"/>
             </wp:cNvGraphicFramePr>
@@ -2254,7 +2328,7 @@
               <a:graphicData uri="http://schemas.openxmlformats.org/drawingml/2006/picture">
                 <pic:pic xmlns:pic="http://schemas.openxmlformats.org/drawingml/2006/picture">
                   <pic:nvPicPr>
-                    <pic:cNvPr id="24" name="Image10"/>
+                    <pic:cNvPr id="10" name="Image10" descr=""/>
                     <pic:cNvPicPr>
                       <a:picLocks noChangeAspect="1" noChangeArrowheads="1"/>
                     </pic:cNvPicPr>
@@ -2273,7 +2347,6 @@
                     <a:prstGeom prst="rect">
                       <a:avLst/>
                     </a:prstGeom>
-                    <a:noFill/>
                   </pic:spPr>
                 </pic:pic>
               </a:graphicData>
@@ -2302,7 +2375,7 @@
       <w:r>
         <w:rPr/>
         <w:drawing>
-          <wp:anchor distT="0" distB="0" distL="0" distR="0" simplePos="0" relativeHeight="19" behindDoc="0" locked="0" layoutInCell="0" allowOverlap="1">
+          <wp:anchor behindDoc="0" distT="0" distB="0" distL="0" distR="0" simplePos="0" locked="0" layoutInCell="0" allowOverlap="1" relativeHeight="22">
             <wp:simplePos x="0" y="0"/>
             <wp:positionH relativeFrom="column">
               <wp:align>center</wp:align>
@@ -2313,7 +2386,7 @@
             <wp:extent cx="6332220" cy="3756025"/>
             <wp:effectExtent l="0" t="0" r="0" b="0"/>
             <wp:wrapSquare wrapText="largest"/>
-            <wp:docPr id="25" name="Image11"/>
+            <wp:docPr id="11" name="Image11" descr=""/>
             <wp:cNvGraphicFramePr>
               <a:graphicFrameLocks xmlns:a="http://schemas.openxmlformats.org/drawingml/2006/main" noChangeAspect="1"/>
             </wp:cNvGraphicFramePr>
@@ -2321,7 +2394,7 @@
               <a:graphicData uri="http://schemas.openxmlformats.org/drawingml/2006/picture">
                 <pic:pic xmlns:pic="http://schemas.openxmlformats.org/drawingml/2006/picture">
                   <pic:nvPicPr>
-                    <pic:cNvPr id="25" name="Image11"/>
+                    <pic:cNvPr id="11" name="Image11" descr=""/>
                     <pic:cNvPicPr>
                       <a:picLocks noChangeAspect="1" noChangeArrowheads="1"/>
                     </pic:cNvPicPr>
@@ -2340,7 +2413,6 @@
                     <a:prstGeom prst="rect">
                       <a:avLst/>
                     </a:prstGeom>
-                    <a:noFill/>
                   </pic:spPr>
                 </pic:pic>
               </a:graphicData>
@@ -2361,42 +2433,752 @@
     </w:p>
     <w:p>
       <w:pPr>
-        <w:pStyle w:val="BodyText"/>
-        <w:bidi w:val="0"/>
-        <w:rPr/>
-      </w:pPr>
-      <w:r>
-        <w:rPr/>
-      </w:r>
-    </w:p>
-    <w:p>
-      <w:pPr>
-        <w:pStyle w:val="BodyText"/>
-        <w:bidi w:val="0"/>
-        <w:rPr/>
-      </w:pPr>
-      <w:r>
-        <w:rPr/>
-      </w:r>
-    </w:p>
-    <w:p>
-      <w:pPr>
-        <w:pStyle w:val="BodyText"/>
-        <w:bidi w:val="0"/>
-        <w:rPr/>
-      </w:pPr>
-      <w:r>
-        <w:rPr/>
-      </w:r>
-    </w:p>
-    <w:p>
-      <w:pPr>
-        <w:pStyle w:val="BodyText"/>
-        <w:bidi w:val="0"/>
-        <w:rPr/>
-      </w:pPr>
-      <w:r>
-        <w:rPr/>
+        <w:pStyle w:val="Heading1"/>
+        <w:numPr>
+          <w:ilvl w:val="0"/>
+          <w:numId w:val="2"/>
+        </w:numPr>
+        <w:ind w:hanging="0" w:left="0"/>
+        <w:rPr/>
+      </w:pPr>
+      <w:r>
+        <w:rPr/>
+        <w:t xml:space="preserve">Import (Reference ) module từ thư mục khác </w:t>
+      </w:r>
+    </w:p>
+    <w:p>
+      <w:pPr>
+        <w:pStyle w:val="BodyText"/>
+        <w:bidi w:val="0"/>
+        <w:rPr/>
+      </w:pPr>
+      <w:r>
+        <w:rPr/>
+        <w:t>Ở ví dụ này ta sẽ thực thi lệnh iverilog từ thư mục cha MiniProject không phải từ thư mục con.</w:t>
+      </w:r>
+    </w:p>
+    <w:p>
+      <w:pPr>
+        <w:pStyle w:val="BodyText"/>
+        <w:bidi w:val="0"/>
+        <w:rPr/>
+      </w:pPr>
+      <w:r>
+        <w:rPr/>
+      </w:r>
+      <w:r>
+        <mc:AlternateContent>
+          <mc:Choice Requires="wps">
+            <w:drawing>
+              <wp:anchor behindDoc="0" distT="0" distB="0" distL="0" distR="0" simplePos="0" locked="0" layoutInCell="0" allowOverlap="1" relativeHeight="27">
+                <wp:simplePos x="0" y="0"/>
+                <wp:positionH relativeFrom="column">
+                  <wp:posOffset>2175510</wp:posOffset>
+                </wp:positionH>
+                <wp:positionV relativeFrom="paragraph">
+                  <wp:posOffset>168910</wp:posOffset>
+                </wp:positionV>
+                <wp:extent cx="1981200" cy="3089910"/>
+                <wp:effectExtent l="0" t="0" r="0" b="0"/>
+                <wp:wrapTopAndBottom/>
+                <wp:docPr id="12" name="Frame8"/>
+                <a:graphic xmlns:a="http://schemas.openxmlformats.org/drawingml/2006/main">
+                  <a:graphicData uri="http://schemas.microsoft.com/office/word/2010/wordprocessingShape">
+                    <wps:wsp>
+                      <wps:cNvSpPr txBox="1"/>
+                      <wps:spPr>
+                        <a:xfrm>
+                          <a:off x="0" y="0"/>
+                          <a:ext cx="1981200" cy="3089910"/>
+                        </a:xfrm>
+                        <a:prstGeom prst="rect"/>
+                        <a:solidFill>
+                          <a:srgbClr val="FFFFFF"/>
+                        </a:solidFill>
+                      </wps:spPr>
+                      <wps:txbx>
+                        <w:txbxContent>
+                          <w:p>
+                            <w:pPr>
+                              <w:pStyle w:val="Figure"/>
+                              <w:spacing w:before="120" w:after="120"/>
+                              <w:rPr/>
+                            </w:pPr>
+                            <w:r>
+                              <w:rPr/>
+                              <w:drawing>
+                                <wp:inline distT="0" distB="0" distL="0" distR="0">
+                                  <wp:extent cx="1981200" cy="2762250"/>
+                                  <wp:effectExtent l="0" t="0" r="0" b="0"/>
+                                  <wp:docPr id="13" name="Image12" descr=""/>
+                                  <wp:cNvGraphicFramePr>
+                                    <a:graphicFrameLocks xmlns:a="http://schemas.openxmlformats.org/drawingml/2006/main" noChangeAspect="1"/>
+                                  </wp:cNvGraphicFramePr>
+                                  <a:graphic xmlns:a="http://schemas.openxmlformats.org/drawingml/2006/main">
+                                    <a:graphicData uri="http://schemas.openxmlformats.org/drawingml/2006/picture">
+                                      <pic:pic xmlns:pic="http://schemas.openxmlformats.org/drawingml/2006/picture">
+                                        <pic:nvPicPr>
+                                          <pic:cNvPr id="13" name="Image12" descr=""/>
+                                          <pic:cNvPicPr>
+                                            <a:picLocks noChangeAspect="1" noChangeArrowheads="1"/>
+                                          </pic:cNvPicPr>
+                                        </pic:nvPicPr>
+                                        <pic:blipFill>
+                                          <a:blip r:embed="rId20"/>
+                                          <a:stretch>
+                                            <a:fillRect/>
+                                          </a:stretch>
+                                        </pic:blipFill>
+                                        <pic:spPr bwMode="auto">
+                                          <a:xfrm>
+                                            <a:off x="0" y="0"/>
+                                            <a:ext cx="1981200" cy="2762250"/>
+                                          </a:xfrm>
+                                          <a:prstGeom prst="rect">
+                                            <a:avLst/>
+                                          </a:prstGeom>
+                                        </pic:spPr>
+                                      </pic:pic>
+                                    </a:graphicData>
+                                  </a:graphic>
+                                </wp:inline>
+                              </w:drawing>
+                              <w:t xml:space="preserve">Figure </w:t>
+                            </w:r>
+                            <w:r>
+                              <w:rPr/>
+                              <w:fldChar w:fldCharType="begin"/>
+                            </w:r>
+                            <w:r>
+                              <w:rPr/>
+                              <w:instrText xml:space="preserve"> SEQ Figure \* ARABIC </w:instrText>
+                            </w:r>
+                            <w:r>
+                              <w:rPr/>
+                              <w:fldChar w:fldCharType="separate"/>
+                            </w:r>
+                            <w:r>
+                              <w:rPr/>
+                              <w:t>8</w:t>
+                            </w:r>
+                            <w:r>
+                              <w:rPr/>
+                              <w:fldChar w:fldCharType="end"/>
+                            </w:r>
+                            <w:r>
+                              <w:rPr/>
+                              <w:t>: cấu trúc thư mục</w:t>
+                            </w:r>
+                          </w:p>
+                        </w:txbxContent>
+                      </wps:txbx>
+                      <wps:bodyPr anchor="t" lIns="0" tIns="0" rIns="0" bIns="0">
+                        <a:noAutofit/>
+                      </wps:bodyPr>
+                    </wps:wsp>
+                  </a:graphicData>
+                </a:graphic>
+              </wp:anchor>
+            </w:drawing>
+          </mc:Choice>
+          <mc:Fallback>
+            <w:pict>
+              <v:rect style="position:absolute;rotation:-0;width:156pt;height:243.3pt;mso-wrap-distance-left:0pt;mso-wrap-distance-right:0pt;mso-wrap-distance-top:0pt;mso-wrap-distance-bottom:0pt;margin-top:13.3pt;mso-position-vertical-relative:text;margin-left:171.3pt;mso-position-horizontal-relative:text">
+                <v:textbox inset="0in,0in,0in,0in">
+                  <w:txbxContent>
+                    <w:p>
+                      <w:pPr>
+                        <w:pStyle w:val="Figure"/>
+                        <w:spacing w:before="120" w:after="120"/>
+                        <w:rPr/>
+                      </w:pPr>
+                      <w:r>
+                        <w:rPr/>
+                        <w:drawing>
+                          <wp:inline distT="0" distB="0" distL="0" distR="0">
+                            <wp:extent cx="1981200" cy="2762250"/>
+                            <wp:effectExtent l="0" t="0" r="0" b="0"/>
+                            <wp:docPr id="14" name="Image12" descr=""/>
+                            <wp:cNvGraphicFramePr>
+                              <a:graphicFrameLocks xmlns:a="http://schemas.openxmlformats.org/drawingml/2006/main" noChangeAspect="1"/>
+                            </wp:cNvGraphicFramePr>
+                            <a:graphic xmlns:a="http://schemas.openxmlformats.org/drawingml/2006/main">
+                              <a:graphicData uri="http://schemas.openxmlformats.org/drawingml/2006/picture">
+                                <pic:pic xmlns:pic="http://schemas.openxmlformats.org/drawingml/2006/picture">
+                                  <pic:nvPicPr>
+                                    <pic:cNvPr id="14" name="Image12" descr=""/>
+                                    <pic:cNvPicPr>
+                                      <a:picLocks noChangeAspect="1" noChangeArrowheads="1"/>
+                                    </pic:cNvPicPr>
+                                  </pic:nvPicPr>
+                                  <pic:blipFill>
+                                    <a:blip r:embed="rId21"/>
+                                    <a:stretch>
+                                      <a:fillRect/>
+                                    </a:stretch>
+                                  </pic:blipFill>
+                                  <pic:spPr bwMode="auto">
+                                    <a:xfrm>
+                                      <a:off x="0" y="0"/>
+                                      <a:ext cx="1981200" cy="2762250"/>
+                                    </a:xfrm>
+                                    <a:prstGeom prst="rect">
+                                      <a:avLst/>
+                                    </a:prstGeom>
+                                  </pic:spPr>
+                                </pic:pic>
+                              </a:graphicData>
+                            </a:graphic>
+                          </wp:inline>
+                        </w:drawing>
+                        <w:t xml:space="preserve">Figure </w:t>
+                      </w:r>
+                      <w:r>
+                        <w:rPr/>
+                        <w:fldChar w:fldCharType="begin"/>
+                      </w:r>
+                      <w:r>
+                        <w:rPr/>
+                        <w:instrText xml:space="preserve"> SEQ Figure \* ARABIC </w:instrText>
+                      </w:r>
+                      <w:r>
+                        <w:rPr/>
+                        <w:fldChar w:fldCharType="separate"/>
+                      </w:r>
+                      <w:r>
+                        <w:rPr/>
+                        <w:t>8</w:t>
+                      </w:r>
+                      <w:r>
+                        <w:rPr/>
+                        <w:fldChar w:fldCharType="end"/>
+                      </w:r>
+                      <w:r>
+                        <w:rPr/>
+                        <w:t>: cấu trúc thư mục</w:t>
+                      </w:r>
+                    </w:p>
+                  </w:txbxContent>
+                </v:textbox>
+                <w10:wrap type="topAndBottom"/>
+              </v:rect>
+            </w:pict>
+          </mc:Fallback>
+        </mc:AlternateContent>
+      </w:r>
+    </w:p>
+    <w:p>
+      <w:pPr>
+        <w:pStyle w:val="BodyText"/>
+        <w:bidi w:val="0"/>
+        <w:rPr/>
+      </w:pPr>
+      <w:r>
+        <w:rPr/>
+        <w:tab/>
+        <w:tab/>
+        <w:tab/>
+        <w:tab/>
+      </w:r>
+      <w:r>
+        <mc:AlternateContent>
+          <mc:Choice Requires="wps">
+            <w:drawing>
+              <wp:anchor behindDoc="0" distT="0" distB="0" distL="0" distR="0" simplePos="0" locked="0" layoutInCell="0" allowOverlap="1" relativeHeight="29">
+                <wp:simplePos x="0" y="0"/>
+                <wp:positionH relativeFrom="column">
+                  <wp:align>center</wp:align>
+                </wp:positionH>
+                <wp:positionV relativeFrom="paragraph">
+                  <wp:posOffset>635</wp:posOffset>
+                </wp:positionV>
+                <wp:extent cx="6067425" cy="2480310"/>
+                <wp:effectExtent l="0" t="0" r="0" b="0"/>
+                <wp:wrapTopAndBottom/>
+                <wp:docPr id="15" name="Frame9"/>
+                <a:graphic xmlns:a="http://schemas.openxmlformats.org/drawingml/2006/main">
+                  <a:graphicData uri="http://schemas.microsoft.com/office/word/2010/wordprocessingShape">
+                    <wps:wsp>
+                      <wps:cNvSpPr txBox="1"/>
+                      <wps:spPr>
+                        <a:xfrm>
+                          <a:off x="0" y="0"/>
+                          <a:ext cx="6067425" cy="2480310"/>
+                        </a:xfrm>
+                        <a:prstGeom prst="rect"/>
+                        <a:solidFill>
+                          <a:srgbClr val="FFFFFF"/>
+                        </a:solidFill>
+                      </wps:spPr>
+                      <wps:txbx>
+                        <w:txbxContent>
+                          <w:p>
+                            <w:pPr>
+                              <w:pStyle w:val="Figure"/>
+                              <w:spacing w:before="120" w:after="120"/>
+                              <w:rPr/>
+                            </w:pPr>
+                            <w:r>
+                              <w:rPr/>
+                              <w:drawing>
+                                <wp:inline distT="0" distB="0" distL="0" distR="0">
+                                  <wp:extent cx="6067425" cy="2152650"/>
+                                  <wp:effectExtent l="0" t="0" r="0" b="0"/>
+                                  <wp:docPr id="16" name="Image13" descr=""/>
+                                  <wp:cNvGraphicFramePr>
+                                    <a:graphicFrameLocks xmlns:a="http://schemas.openxmlformats.org/drawingml/2006/main" noChangeAspect="1"/>
+                                  </wp:cNvGraphicFramePr>
+                                  <a:graphic xmlns:a="http://schemas.openxmlformats.org/drawingml/2006/main">
+                                    <a:graphicData uri="http://schemas.openxmlformats.org/drawingml/2006/picture">
+                                      <pic:pic xmlns:pic="http://schemas.openxmlformats.org/drawingml/2006/picture">
+                                        <pic:nvPicPr>
+                                          <pic:cNvPr id="16" name="Image13" descr=""/>
+                                          <pic:cNvPicPr>
+                                            <a:picLocks noChangeAspect="1" noChangeArrowheads="1"/>
+                                          </pic:cNvPicPr>
+                                        </pic:nvPicPr>
+                                        <pic:blipFill>
+                                          <a:blip r:embed="rId22"/>
+                                          <a:stretch>
+                                            <a:fillRect/>
+                                          </a:stretch>
+                                        </pic:blipFill>
+                                        <pic:spPr bwMode="auto">
+                                          <a:xfrm>
+                                            <a:off x="0" y="0"/>
+                                            <a:ext cx="6067425" cy="2152650"/>
+                                          </a:xfrm>
+                                          <a:prstGeom prst="rect">
+                                            <a:avLst/>
+                                          </a:prstGeom>
+                                        </pic:spPr>
+                                      </pic:pic>
+                                    </a:graphicData>
+                                  </a:graphic>
+                                </wp:inline>
+                              </w:drawing>
+                              <w:t xml:space="preserve">Figure </w:t>
+                            </w:r>
+                            <w:r>
+                              <w:rPr/>
+                              <w:fldChar w:fldCharType="begin"/>
+                            </w:r>
+                            <w:r>
+                              <w:rPr/>
+                              <w:instrText xml:space="preserve"> SEQ Figure \* ARABIC </w:instrText>
+                            </w:r>
+                            <w:r>
+                              <w:rPr/>
+                              <w:fldChar w:fldCharType="separate"/>
+                            </w:r>
+                            <w:r>
+                              <w:rPr/>
+                              <w:t>9</w:t>
+                            </w:r>
+                            <w:r>
+                              <w:rPr/>
+                              <w:fldChar w:fldCharType="end"/>
+                            </w:r>
+                            <w:r>
+                              <w:rPr/>
+                              <w:t>: Reference giữa các module trong cùng thư mục ( lấy folder-cha MiniProject làm gốc )</w:t>
+                            </w:r>
+                          </w:p>
+                        </w:txbxContent>
+                      </wps:txbx>
+                      <wps:bodyPr anchor="t" lIns="0" tIns="0" rIns="0" bIns="0">
+                        <a:noAutofit/>
+                      </wps:bodyPr>
+                    </wps:wsp>
+                  </a:graphicData>
+                </a:graphic>
+              </wp:anchor>
+            </w:drawing>
+          </mc:Choice>
+          <mc:Fallback>
+            <w:pict>
+              <v:rect style="position:absolute;rotation:-0;width:477.75pt;height:195.3pt;mso-wrap-distance-left:0pt;mso-wrap-distance-right:0pt;mso-wrap-distance-top:0pt;mso-wrap-distance-bottom:0pt;margin-top:0pt;mso-position-vertical:top;mso-position-vertical-relative:text;margin-left:10.45pt;mso-position-horizontal:center;mso-position-horizontal-relative:text">
+                <v:textbox inset="0in,0in,0in,0in">
+                  <w:txbxContent>
+                    <w:p>
+                      <w:pPr>
+                        <w:pStyle w:val="Figure"/>
+                        <w:spacing w:before="120" w:after="120"/>
+                        <w:rPr/>
+                      </w:pPr>
+                      <w:r>
+                        <w:rPr/>
+                        <w:drawing>
+                          <wp:inline distT="0" distB="0" distL="0" distR="0">
+                            <wp:extent cx="6067425" cy="2152650"/>
+                            <wp:effectExtent l="0" t="0" r="0" b="0"/>
+                            <wp:docPr id="17" name="Image13" descr=""/>
+                            <wp:cNvGraphicFramePr>
+                              <a:graphicFrameLocks xmlns:a="http://schemas.openxmlformats.org/drawingml/2006/main" noChangeAspect="1"/>
+                            </wp:cNvGraphicFramePr>
+                            <a:graphic xmlns:a="http://schemas.openxmlformats.org/drawingml/2006/main">
+                              <a:graphicData uri="http://schemas.openxmlformats.org/drawingml/2006/picture">
+                                <pic:pic xmlns:pic="http://schemas.openxmlformats.org/drawingml/2006/picture">
+                                  <pic:nvPicPr>
+                                    <pic:cNvPr id="17" name="Image13" descr=""/>
+                                    <pic:cNvPicPr>
+                                      <a:picLocks noChangeAspect="1" noChangeArrowheads="1"/>
+                                    </pic:cNvPicPr>
+                                  </pic:nvPicPr>
+                                  <pic:blipFill>
+                                    <a:blip r:embed="rId23"/>
+                                    <a:stretch>
+                                      <a:fillRect/>
+                                    </a:stretch>
+                                  </pic:blipFill>
+                                  <pic:spPr bwMode="auto">
+                                    <a:xfrm>
+                                      <a:off x="0" y="0"/>
+                                      <a:ext cx="6067425" cy="2152650"/>
+                                    </a:xfrm>
+                                    <a:prstGeom prst="rect">
+                                      <a:avLst/>
+                                    </a:prstGeom>
+                                  </pic:spPr>
+                                </pic:pic>
+                              </a:graphicData>
+                            </a:graphic>
+                          </wp:inline>
+                        </w:drawing>
+                        <w:t xml:space="preserve">Figure </w:t>
+                      </w:r>
+                      <w:r>
+                        <w:rPr/>
+                        <w:fldChar w:fldCharType="begin"/>
+                      </w:r>
+                      <w:r>
+                        <w:rPr/>
+                        <w:instrText xml:space="preserve"> SEQ Figure \* ARABIC </w:instrText>
+                      </w:r>
+                      <w:r>
+                        <w:rPr/>
+                        <w:fldChar w:fldCharType="separate"/>
+                      </w:r>
+                      <w:r>
+                        <w:rPr/>
+                        <w:t>9</w:t>
+                      </w:r>
+                      <w:r>
+                        <w:rPr/>
+                        <w:fldChar w:fldCharType="end"/>
+                      </w:r>
+                      <w:r>
+                        <w:rPr/>
+                        <w:t>: Reference giữa các module trong cùng thư mục ( lấy folder-cha MiniProject làm gốc )</w:t>
+                      </w:r>
+                    </w:p>
+                  </w:txbxContent>
+                </v:textbox>
+                <w10:wrap type="topAndBottom"/>
+              </v:rect>
+            </w:pict>
+          </mc:Fallback>
+        </mc:AlternateContent>
+      </w:r>
+    </w:p>
+    <w:p>
+      <w:pPr>
+        <w:pStyle w:val="BodyText"/>
+        <w:bidi w:val="0"/>
+        <w:rPr/>
+      </w:pPr>
+      <w:r>
+        <w:rPr/>
+      </w:r>
+      <w:r>
+        <mc:AlternateContent>
+          <mc:Choice Requires="wps">
+            <w:drawing>
+              <wp:anchor behindDoc="0" distT="0" distB="0" distL="0" distR="0" simplePos="0" locked="0" layoutInCell="0" allowOverlap="1" relativeHeight="31">
+                <wp:simplePos x="0" y="0"/>
+                <wp:positionH relativeFrom="column">
+                  <wp:align>center</wp:align>
+                </wp:positionH>
+                <wp:positionV relativeFrom="paragraph">
+                  <wp:posOffset>635</wp:posOffset>
+                </wp:positionV>
+                <wp:extent cx="5648325" cy="4074795"/>
+                <wp:effectExtent l="0" t="0" r="0" b="0"/>
+                <wp:wrapTopAndBottom/>
+                <wp:docPr id="18" name="Frame10"/>
+                <a:graphic xmlns:a="http://schemas.openxmlformats.org/drawingml/2006/main">
+                  <a:graphicData uri="http://schemas.microsoft.com/office/word/2010/wordprocessingShape">
+                    <wps:wsp>
+                      <wps:cNvSpPr txBox="1"/>
+                      <wps:spPr>
+                        <a:xfrm>
+                          <a:off x="0" y="0"/>
+                          <a:ext cx="5648325" cy="4074795"/>
+                        </a:xfrm>
+                        <a:prstGeom prst="rect"/>
+                        <a:solidFill>
+                          <a:srgbClr val="FFFFFF"/>
+                        </a:solidFill>
+                      </wps:spPr>
+                      <wps:txbx>
+                        <w:txbxContent>
+                          <w:p>
+                            <w:pPr>
+                              <w:pStyle w:val="Figure"/>
+                              <w:spacing w:before="120" w:after="120"/>
+                              <w:rPr/>
+                            </w:pPr>
+                            <w:r>
+                              <w:rPr/>
+                              <w:drawing>
+                                <wp:inline distT="0" distB="0" distL="0" distR="0">
+                                  <wp:extent cx="5648325" cy="3571875"/>
+                                  <wp:effectExtent l="0" t="0" r="0" b="0"/>
+                                  <wp:docPr id="19" name="Image14" descr=""/>
+                                  <wp:cNvGraphicFramePr>
+                                    <a:graphicFrameLocks xmlns:a="http://schemas.openxmlformats.org/drawingml/2006/main" noChangeAspect="1"/>
+                                  </wp:cNvGraphicFramePr>
+                                  <a:graphic xmlns:a="http://schemas.openxmlformats.org/drawingml/2006/main">
+                                    <a:graphicData uri="http://schemas.openxmlformats.org/drawingml/2006/picture">
+                                      <pic:pic xmlns:pic="http://schemas.openxmlformats.org/drawingml/2006/picture">
+                                        <pic:nvPicPr>
+                                          <pic:cNvPr id="19" name="Image14" descr=""/>
+                                          <pic:cNvPicPr>
+                                            <a:picLocks noChangeAspect="1" noChangeArrowheads="1"/>
+                                          </pic:cNvPicPr>
+                                        </pic:nvPicPr>
+                                        <pic:blipFill>
+                                          <a:blip r:embed="rId24"/>
+                                          <a:stretch>
+                                            <a:fillRect/>
+                                          </a:stretch>
+                                        </pic:blipFill>
+                                        <pic:spPr bwMode="auto">
+                                          <a:xfrm>
+                                            <a:off x="0" y="0"/>
+                                            <a:ext cx="5648325" cy="3571875"/>
+                                          </a:xfrm>
+                                          <a:prstGeom prst="rect">
+                                            <a:avLst/>
+                                          </a:prstGeom>
+                                        </pic:spPr>
+                                      </pic:pic>
+                                    </a:graphicData>
+                                  </a:graphic>
+                                </wp:inline>
+                              </w:drawing>
+                              <w:t xml:space="preserve">Figure </w:t>
+                            </w:r>
+                            <w:r>
+                              <w:rPr/>
+                              <w:fldChar w:fldCharType="begin"/>
+                            </w:r>
+                            <w:r>
+                              <w:rPr/>
+                              <w:instrText xml:space="preserve"> SEQ Figure \* ARABIC </w:instrText>
+                            </w:r>
+                            <w:r>
+                              <w:rPr/>
+                              <w:fldChar w:fldCharType="separate"/>
+                            </w:r>
+                            <w:r>
+                              <w:rPr/>
+                              <w:t>10</w:t>
+                            </w:r>
+                            <w:r>
+                              <w:rPr/>
+                              <w:fldChar w:fldCharType="end"/>
+                            </w:r>
+                            <w:r>
+                              <w:rPr/>
+                              <w:t>: Reference giữa các module khác thư mục ( lấy thư mục-cha MiniProject làm gốc )</w:t>
+                            </w:r>
+                          </w:p>
+                        </w:txbxContent>
+                      </wps:txbx>
+                      <wps:bodyPr anchor="t" lIns="0" tIns="0" rIns="0" bIns="0">
+                        <a:noAutofit/>
+                      </wps:bodyPr>
+                    </wps:wsp>
+                  </a:graphicData>
+                </a:graphic>
+              </wp:anchor>
+            </w:drawing>
+          </mc:Choice>
+          <mc:Fallback>
+            <w:pict>
+              <v:rect style="position:absolute;rotation:-0;width:444.75pt;height:320.85pt;mso-wrap-distance-left:0pt;mso-wrap-distance-right:0pt;mso-wrap-distance-top:0pt;mso-wrap-distance-bottom:0pt;margin-top:0pt;mso-position-vertical:top;mso-position-vertical-relative:text;margin-left:26.95pt;mso-position-horizontal:center;mso-position-horizontal-relative:text">
+                <v:textbox inset="0in,0in,0in,0in">
+                  <w:txbxContent>
+                    <w:p>
+                      <w:pPr>
+                        <w:pStyle w:val="Figure"/>
+                        <w:spacing w:before="120" w:after="120"/>
+                        <w:rPr/>
+                      </w:pPr>
+                      <w:r>
+                        <w:rPr/>
+                        <w:drawing>
+                          <wp:inline distT="0" distB="0" distL="0" distR="0">
+                            <wp:extent cx="5648325" cy="3571875"/>
+                            <wp:effectExtent l="0" t="0" r="0" b="0"/>
+                            <wp:docPr id="20" name="Image14" descr=""/>
+                            <wp:cNvGraphicFramePr>
+                              <a:graphicFrameLocks xmlns:a="http://schemas.openxmlformats.org/drawingml/2006/main" noChangeAspect="1"/>
+                            </wp:cNvGraphicFramePr>
+                            <a:graphic xmlns:a="http://schemas.openxmlformats.org/drawingml/2006/main">
+                              <a:graphicData uri="http://schemas.openxmlformats.org/drawingml/2006/picture">
+                                <pic:pic xmlns:pic="http://schemas.openxmlformats.org/drawingml/2006/picture">
+                                  <pic:nvPicPr>
+                                    <pic:cNvPr id="20" name="Image14" descr=""/>
+                                    <pic:cNvPicPr>
+                                      <a:picLocks noChangeAspect="1" noChangeArrowheads="1"/>
+                                    </pic:cNvPicPr>
+                                  </pic:nvPicPr>
+                                  <pic:blipFill>
+                                    <a:blip r:embed="rId25"/>
+                                    <a:stretch>
+                                      <a:fillRect/>
+                                    </a:stretch>
+                                  </pic:blipFill>
+                                  <pic:spPr bwMode="auto">
+                                    <a:xfrm>
+                                      <a:off x="0" y="0"/>
+                                      <a:ext cx="5648325" cy="3571875"/>
+                                    </a:xfrm>
+                                    <a:prstGeom prst="rect">
+                                      <a:avLst/>
+                                    </a:prstGeom>
+                                  </pic:spPr>
+                                </pic:pic>
+                              </a:graphicData>
+                            </a:graphic>
+                          </wp:inline>
+                        </w:drawing>
+                        <w:t xml:space="preserve">Figure </w:t>
+                      </w:r>
+                      <w:r>
+                        <w:rPr/>
+                        <w:fldChar w:fldCharType="begin"/>
+                      </w:r>
+                      <w:r>
+                        <w:rPr/>
+                        <w:instrText xml:space="preserve"> SEQ Figure \* ARABIC </w:instrText>
+                      </w:r>
+                      <w:r>
+                        <w:rPr/>
+                        <w:fldChar w:fldCharType="separate"/>
+                      </w:r>
+                      <w:r>
+                        <w:rPr/>
+                        <w:t>10</w:t>
+                      </w:r>
+                      <w:r>
+                        <w:rPr/>
+                        <w:fldChar w:fldCharType="end"/>
+                      </w:r>
+                      <w:r>
+                        <w:rPr/>
+                        <w:t>: Reference giữa các module khác thư mục ( lấy thư mục-cha MiniProject làm gốc )</w:t>
+                      </w:r>
+                    </w:p>
+                  </w:txbxContent>
+                </v:textbox>
+                <w10:wrap type="topAndBottom"/>
+              </v:rect>
+            </w:pict>
+          </mc:Fallback>
+        </mc:AlternateContent>
+      </w:r>
+    </w:p>
+    <w:p>
+      <w:pPr>
+        <w:pStyle w:val="BodyText"/>
+        <w:bidi w:val="0"/>
+        <w:rPr/>
+      </w:pPr>
+      <w:r>
+        <w:rPr/>
+        <w:t xml:space="preserve">Hiện tại ta muốn generate file sim ở sim/comparator_sim.vvp từ thu mục cha MiniProject </w:t>
+      </w:r>
+    </w:p>
+    <w:p>
+      <w:pPr>
+        <w:pStyle w:val="BodyText"/>
+        <w:bidi w:val="0"/>
+        <w:rPr/>
+      </w:pPr>
+      <w:r>
+        <w:rPr/>
+        <w:t>cd to MiniProject_folder → thực thi command:</w:t>
+      </w:r>
+    </w:p>
+    <w:tbl>
+      <w:tblPr>
+        <w:tblW w:w="5000" w:type="pct"/>
+        <w:jc w:val="left"/>
+        <w:tblInd w:w="-5" w:type="dxa"/>
+        <w:tblLayout w:type="fixed"/>
+        <w:tblCellMar>
+          <w:top w:w="55" w:type="dxa"/>
+          <w:left w:w="55" w:type="dxa"/>
+          <w:bottom w:w="55" w:type="dxa"/>
+          <w:right w:w="55" w:type="dxa"/>
+        </w:tblCellMar>
+      </w:tblPr>
+      <w:tblGrid>
+        <w:gridCol w:w="9972"/>
+      </w:tblGrid>
+      <w:tr>
+        <w:trPr/>
+        <w:tc>
+          <w:tcPr>
+            <w:tcW w:w="9972" w:type="dxa"/>
+            <w:tcBorders>
+              <w:top w:val="single" w:sz="4" w:space="0" w:color="000000"/>
+              <w:left w:val="single" w:sz="4" w:space="0" w:color="000000"/>
+              <w:bottom w:val="single" w:sz="4" w:space="0" w:color="000000"/>
+              <w:right w:val="single" w:sz="4" w:space="0" w:color="000000"/>
+            </w:tcBorders>
+          </w:tcPr>
+          <w:p>
+            <w:pPr>
+              <w:pStyle w:val="TableContents"/>
+              <w:rPr>
+                <w:b/>
+                <w:bCs/>
+              </w:rPr>
+            </w:pPr>
+            <w:r>
+              <w:rPr>
+                <w:b/>
+                <w:bCs/>
+              </w:rPr>
+              <w:t>iverilog -o sim/comparator_sim.vvp tb/comparator_nbit_tb.v</w:t>
+            </w:r>
+          </w:p>
+        </w:tc>
+      </w:tr>
+    </w:tbl>
+    <w:p>
+      <w:pPr>
+        <w:pStyle w:val="BodyText"/>
+        <w:bidi w:val="0"/>
+        <w:rPr/>
+      </w:pPr>
+      <w:r>
+        <w:rPr/>
+      </w:r>
+    </w:p>
+    <w:p>
+      <w:pPr>
+        <w:pStyle w:val="BodyText"/>
+        <w:bidi w:val="0"/>
+        <w:rPr/>
+      </w:pPr>
+      <w:r>
+        <w:rPr/>
+        <w:t>Sẽ generate sim/comparator_sim.vvp ở trong folder /sim.</w:t>
       </w:r>
     </w:p>
     <w:p>
@@ -2647,6 +3429,7 @@
       <w:pgNumType w:fmt="decimal"/>
       <w:formProt w:val="false"/>
       <w:textDirection w:val="lrTb"/>
+      <w:docGrid w:type="default" w:linePitch="100" w:charSpace="0"/>
     </w:sectPr>
   </w:body>
 </w:document>
@@ -2658,15 +3441,14 @@
     <w:lvl w:ilvl="0">
       <w:start w:val="1"/>
       <w:numFmt w:val="none"/>
-      <w:pStyle w:val="Heading1"/>
       <w:suff w:val="nothing"/>
       <w:lvlText w:val=""/>
-      <w:lvlJc w:val="start"/>
+      <w:lvlJc w:val="left"/>
       <w:pPr>
         <w:tabs>
           <w:tab w:val="num" w:pos="0"/>
         </w:tabs>
-        <w:ind w:start="0" w:hanging="0"/>
+        <w:ind w:left="0" w:hanging="0"/>
       </w:pPr>
     </w:lvl>
     <w:lvl w:ilvl="1">
@@ -2674,12 +3456,12 @@
       <w:numFmt w:val="none"/>
       <w:suff w:val="nothing"/>
       <w:lvlText w:val=""/>
-      <w:lvlJc w:val="start"/>
+      <w:lvlJc w:val="left"/>
       <w:pPr>
         <w:tabs>
           <w:tab w:val="num" w:pos="0"/>
         </w:tabs>
-        <w:ind w:start="0" w:hanging="0"/>
+        <w:ind w:left="0" w:hanging="0"/>
       </w:pPr>
     </w:lvl>
     <w:lvl w:ilvl="2">
@@ -2687,12 +3469,12 @@
       <w:numFmt w:val="none"/>
       <w:suff w:val="nothing"/>
       <w:lvlText w:val=""/>
-      <w:lvlJc w:val="start"/>
+      <w:lvlJc w:val="left"/>
       <w:pPr>
         <w:tabs>
           <w:tab w:val="num" w:pos="0"/>
         </w:tabs>
-        <w:ind w:start="0" w:hanging="0"/>
+        <w:ind w:left="0" w:hanging="0"/>
       </w:pPr>
     </w:lvl>
     <w:lvl w:ilvl="3">
@@ -2700,12 +3482,12 @@
       <w:numFmt w:val="none"/>
       <w:suff w:val="nothing"/>
       <w:lvlText w:val=""/>
-      <w:lvlJc w:val="start"/>
+      <w:lvlJc w:val="left"/>
       <w:pPr>
         <w:tabs>
           <w:tab w:val="num" w:pos="0"/>
         </w:tabs>
-        <w:ind w:start="0" w:hanging="0"/>
+        <w:ind w:left="0" w:hanging="0"/>
       </w:pPr>
     </w:lvl>
     <w:lvl w:ilvl="4">
@@ -2713,12 +3495,12 @@
       <w:numFmt w:val="none"/>
       <w:suff w:val="nothing"/>
       <w:lvlText w:val=""/>
-      <w:lvlJc w:val="start"/>
+      <w:lvlJc w:val="left"/>
       <w:pPr>
         <w:tabs>
           <w:tab w:val="num" w:pos="0"/>
         </w:tabs>
-        <w:ind w:start="0" w:hanging="0"/>
+        <w:ind w:left="0" w:hanging="0"/>
       </w:pPr>
     </w:lvl>
     <w:lvl w:ilvl="5">
@@ -2726,12 +3508,12 @@
       <w:numFmt w:val="none"/>
       <w:suff w:val="nothing"/>
       <w:lvlText w:val=""/>
-      <w:lvlJc w:val="start"/>
+      <w:lvlJc w:val="left"/>
       <w:pPr>
         <w:tabs>
           <w:tab w:val="num" w:pos="0"/>
         </w:tabs>
-        <w:ind w:start="0" w:hanging="0"/>
+        <w:ind w:left="0" w:hanging="0"/>
       </w:pPr>
     </w:lvl>
     <w:lvl w:ilvl="6">
@@ -2739,12 +3521,12 @@
       <w:numFmt w:val="none"/>
       <w:suff w:val="nothing"/>
       <w:lvlText w:val=""/>
-      <w:lvlJc w:val="start"/>
+      <w:lvlJc w:val="left"/>
       <w:pPr>
         <w:tabs>
           <w:tab w:val="num" w:pos="0"/>
         </w:tabs>
-        <w:ind w:start="0" w:hanging="0"/>
+        <w:ind w:left="0" w:hanging="0"/>
       </w:pPr>
     </w:lvl>
     <w:lvl w:ilvl="7">
@@ -2752,12 +3534,12 @@
       <w:numFmt w:val="none"/>
       <w:suff w:val="nothing"/>
       <w:lvlText w:val=""/>
-      <w:lvlJc w:val="start"/>
+      <w:lvlJc w:val="left"/>
       <w:pPr>
         <w:tabs>
           <w:tab w:val="num" w:pos="0"/>
         </w:tabs>
-        <w:ind w:start="0" w:hanging="0"/>
+        <w:ind w:left="0" w:hanging="0"/>
       </w:pPr>
     </w:lvl>
     <w:lvl w:ilvl="8">
@@ -2765,17 +3547,148 @@
       <w:numFmt w:val="none"/>
       <w:suff w:val="nothing"/>
       <w:lvlText w:val=""/>
-      <w:lvlJc w:val="start"/>
+      <w:lvlJc w:val="left"/>
       <w:pPr>
         <w:tabs>
           <w:tab w:val="num" w:pos="0"/>
         </w:tabs>
-        <w:ind w:start="0" w:hanging="0"/>
-      </w:pPr>
+        <w:ind w:left="0" w:hanging="0"/>
+      </w:pPr>
+    </w:lvl>
+  </w:abstractNum>
+  <w:abstractNum w:abstractNumId="2">
+    <w:lvl w:ilvl="0">
+      <w:start w:val="1"/>
+      <w:numFmt w:val="none"/>
+      <w:suff w:val="nothing"/>
+      <w:lvlText w:val=""/>
+      <w:lvlJc w:val="left"/>
+      <w:pPr>
+        <w:tabs>
+          <w:tab w:val="num" w:pos="0"/>
+        </w:tabs>
+        <w:ind w:left="0" w:hanging="0"/>
+      </w:pPr>
+      <w:rPr/>
+    </w:lvl>
+    <w:lvl w:ilvl="1">
+      <w:start w:val="1"/>
+      <w:numFmt w:val="none"/>
+      <w:suff w:val="nothing"/>
+      <w:lvlText w:val=""/>
+      <w:lvlJc w:val="left"/>
+      <w:pPr>
+        <w:tabs>
+          <w:tab w:val="num" w:pos="0"/>
+        </w:tabs>
+        <w:ind w:left="0" w:hanging="0"/>
+      </w:pPr>
+      <w:rPr/>
+    </w:lvl>
+    <w:lvl w:ilvl="2">
+      <w:start w:val="1"/>
+      <w:numFmt w:val="none"/>
+      <w:suff w:val="nothing"/>
+      <w:lvlText w:val=""/>
+      <w:lvlJc w:val="left"/>
+      <w:pPr>
+        <w:tabs>
+          <w:tab w:val="num" w:pos="0"/>
+        </w:tabs>
+        <w:ind w:left="0" w:hanging="0"/>
+      </w:pPr>
+      <w:rPr/>
+    </w:lvl>
+    <w:lvl w:ilvl="3">
+      <w:start w:val="1"/>
+      <w:numFmt w:val="none"/>
+      <w:suff w:val="nothing"/>
+      <w:lvlText w:val=""/>
+      <w:lvlJc w:val="left"/>
+      <w:pPr>
+        <w:tabs>
+          <w:tab w:val="num" w:pos="0"/>
+        </w:tabs>
+        <w:ind w:left="0" w:hanging="0"/>
+      </w:pPr>
+      <w:rPr/>
+    </w:lvl>
+    <w:lvl w:ilvl="4">
+      <w:start w:val="1"/>
+      <w:numFmt w:val="none"/>
+      <w:suff w:val="nothing"/>
+      <w:lvlText w:val=""/>
+      <w:lvlJc w:val="left"/>
+      <w:pPr>
+        <w:tabs>
+          <w:tab w:val="num" w:pos="0"/>
+        </w:tabs>
+        <w:ind w:left="0" w:hanging="0"/>
+      </w:pPr>
+      <w:rPr/>
+    </w:lvl>
+    <w:lvl w:ilvl="5">
+      <w:start w:val="1"/>
+      <w:numFmt w:val="none"/>
+      <w:suff w:val="nothing"/>
+      <w:lvlText w:val=""/>
+      <w:lvlJc w:val="left"/>
+      <w:pPr>
+        <w:tabs>
+          <w:tab w:val="num" w:pos="0"/>
+        </w:tabs>
+        <w:ind w:left="0" w:hanging="0"/>
+      </w:pPr>
+      <w:rPr/>
+    </w:lvl>
+    <w:lvl w:ilvl="6">
+      <w:start w:val="1"/>
+      <w:numFmt w:val="none"/>
+      <w:suff w:val="nothing"/>
+      <w:lvlText w:val=""/>
+      <w:lvlJc w:val="left"/>
+      <w:pPr>
+        <w:tabs>
+          <w:tab w:val="num" w:pos="0"/>
+        </w:tabs>
+        <w:ind w:left="0" w:hanging="0"/>
+      </w:pPr>
+      <w:rPr/>
+    </w:lvl>
+    <w:lvl w:ilvl="7">
+      <w:start w:val="1"/>
+      <w:numFmt w:val="none"/>
+      <w:suff w:val="nothing"/>
+      <w:lvlText w:val=""/>
+      <w:lvlJc w:val="left"/>
+      <w:pPr>
+        <w:tabs>
+          <w:tab w:val="num" w:pos="0"/>
+        </w:tabs>
+        <w:ind w:left="0" w:hanging="0"/>
+      </w:pPr>
+      <w:rPr/>
+    </w:lvl>
+    <w:lvl w:ilvl="8">
+      <w:start w:val="1"/>
+      <w:numFmt w:val="none"/>
+      <w:suff w:val="nothing"/>
+      <w:lvlText w:val=""/>
+      <w:lvlJc w:val="left"/>
+      <w:pPr>
+        <w:tabs>
+          <w:tab w:val="num" w:pos="0"/>
+        </w:tabs>
+        <w:ind w:left="0" w:hanging="0"/>
+      </w:pPr>
+      <w:rPr/>
     </w:lvl>
   </w:abstractNum>
   <w:num w:numId="1">
     <w:abstractNumId w:val="1"/>
+  </w:num>
+  <w:num w:numId="2">
+    <w:abstractNumId w:val="2"/>
   </w:num>
 </w:numbering>
 </file>
@@ -2794,7 +3707,6 @@
     </w:rPrDefault>
     <w:pPrDefault>
       <w:pPr>
-        <w:widowControl/>
         <w:suppressAutoHyphens w:val="true"/>
       </w:pPr>
     </w:pPrDefault>
@@ -2804,7 +3716,10 @@
     <w:qFormat/>
     <w:pPr>
       <w:widowControl/>
+      <w:suppressAutoHyphens w:val="true"/>
       <w:bidi w:val="0"/>
+      <w:spacing w:before="0" w:after="0"/>
+      <w:jc w:val="left"/>
     </w:pPr>
     <w:rPr>
       <w:rFonts w:ascii="Liberation Serif" w:hAnsi="Liberation Serif" w:eastAsia="NSimSun" w:cs="Lucida Sans"/>
@@ -2816,14 +3731,14 @@
     </w:rPr>
   </w:style>
   <w:style w:type="paragraph" w:styleId="Heading1">
-    <w:name w:val="heading 1"/>
+    <w:name w:val="Heading 1"/>
     <w:basedOn w:val="Heading"/>
     <w:next w:val="BodyText"/>
     <w:qFormat/>
     <w:pPr>
       <w:numPr>
         <w:ilvl w:val="0"/>
-        <w:numId w:val="1"/>
+        <w:numId w:val="2"/>
       </w:numPr>
       <w:spacing w:before="240" w:after="120"/>
       <w:outlineLvl w:val="0"/>
@@ -2875,7 +3790,7 @@
     </w:rPr>
   </w:style>
   <w:style w:type="paragraph" w:styleId="Caption">
-    <w:name w:val="caption"/>
+    <w:name w:val="Caption"/>
     <w:basedOn w:val="Normal"/>
     <w:qFormat/>
     <w:pPr>
@@ -2908,6 +3823,23 @@
     <w:pPr/>
     <w:rPr/>
   </w:style>
+  <w:style w:type="paragraph" w:styleId="FrameContents">
+    <w:name w:val="Frame Contents"/>
+    <w:basedOn w:val="Normal"/>
+    <w:qFormat/>
+    <w:pPr/>
+    <w:rPr/>
+  </w:style>
+  <w:style w:type="paragraph" w:styleId="TableContents">
+    <w:name w:val="Table Contents"/>
+    <w:basedOn w:val="Normal"/>
+    <w:qFormat/>
+    <w:pPr>
+      <w:widowControl w:val="false"/>
+      <w:suppressLineNumbers/>
+    </w:pPr>
+    <w:rPr/>
+  </w:style>
 </w:styles>
 </file>
 
@@ -2919,37 +3851,37 @@
         <a:srgbClr val="000000"/>
       </a:dk1>
       <a:lt1>
-        <a:srgbClr val="FFFFFF"/>
+        <a:srgbClr val="ffffff"/>
       </a:lt1>
       <a:dk2>
         <a:srgbClr val="000000"/>
       </a:dk2>
       <a:lt2>
-        <a:srgbClr val="FFFFFF"/>
+        <a:srgbClr val="ffffff"/>
       </a:lt2>
       <a:accent1>
-        <a:srgbClr val="18A303"/>
+        <a:srgbClr val="18a303"/>
       </a:accent1>
       <a:accent2>
-        <a:srgbClr val="0369A3"/>
+        <a:srgbClr val="0369a3"/>
       </a:accent2>
       <a:accent3>
-        <a:srgbClr val="A33E03"/>
+        <a:srgbClr val="a33e03"/>
       </a:accent3>
       <a:accent4>
-        <a:srgbClr val="8E03A3"/>
+        <a:srgbClr val="8e03a3"/>
       </a:accent4>
       <a:accent5>
-        <a:srgbClr val="C99C00"/>
+        <a:srgbClr val="c99c00"/>
       </a:accent5>
       <a:accent6>
-        <a:srgbClr val="C9211E"/>
+        <a:srgbClr val="c9211e"/>
       </a:accent6>
       <a:hlink>
-        <a:srgbClr val="0000EE"/>
+        <a:srgbClr val="0000ee"/>
       </a:hlink>
       <a:folHlink>
-        <a:srgbClr val="551A8B"/>
+        <a:srgbClr val="551a8b"/>
       </a:folHlink>
     </a:clrScheme>
     <a:fontScheme name="Office">

</xml_diff>